<commit_message>
Pruebas de permisos funcionan y evidencias guardadas
</commit_message>
<xml_diff>
--- a/equipo09_IDY1103_EP1/evidencias/EVIDENCIAS.docx
+++ b/equipo09_IDY1103_EP1/evidencias/EVIDENCIAS.docx
@@ -42,7 +42,7 @@
                     <pic:cNvPicPr/>
                   </pic:nvPicPr>
                   <pic:blipFill>
-                    <a:blip r:embed="rId4"/>
+                    <a:blip r:embed="rId5"/>
                     <a:stretch>
                       <a:fillRect/>
                     </a:stretch>
@@ -90,7 +90,7 @@
                     <pic:cNvPicPr/>
                   </pic:nvPicPr>
                   <pic:blipFill>
-                    <a:blip r:embed="rId5"/>
+                    <a:blip r:embed="rId6"/>
                     <a:stretch>
                       <a:fillRect/>
                     </a:stretch>
@@ -158,7 +158,7 @@
                     <pic:cNvPicPr/>
                   </pic:nvPicPr>
                   <pic:blipFill>
-                    <a:blip r:embed="rId6"/>
+                    <a:blip r:embed="rId7"/>
                     <a:stretch>
                       <a:fillRect/>
                     </a:stretch>
@@ -206,7 +206,7 @@
                     <pic:cNvPicPr/>
                   </pic:nvPicPr>
                   <pic:blipFill>
-                    <a:blip r:embed="rId7"/>
+                    <a:blip r:embed="rId8"/>
                     <a:stretch>
                       <a:fillRect/>
                     </a:stretch>
@@ -270,7 +270,7 @@
                     </pic:cNvPicPr>
                   </pic:nvPicPr>
                   <pic:blipFill>
-                    <a:blip r:embed="rId8">
+                    <a:blip r:embed="rId9">
                       <a:extLst>
                         <a:ext uri="{28A0092B-C50C-407E-A947-70E740481C1C}">
                           <a14:useLocalDpi xmlns:a14="http://schemas.microsoft.com/office/drawing/2010/main" val="0"/>
@@ -329,7 +329,7 @@
                     <pic:cNvPicPr/>
                   </pic:nvPicPr>
                   <pic:blipFill>
-                    <a:blip r:embed="rId9"/>
+                    <a:blip r:embed="rId10"/>
                     <a:stretch>
                       <a:fillRect/>
                     </a:stretch>
@@ -377,7 +377,7 @@
                     <pic:cNvPicPr/>
                   </pic:nvPicPr>
                   <pic:blipFill>
-                    <a:blip r:embed="rId10"/>
+                    <a:blip r:embed="rId11"/>
                     <a:stretch>
                       <a:fillRect/>
                     </a:stretch>
@@ -426,7 +426,7 @@
                     <pic:cNvPicPr/>
                   </pic:nvPicPr>
                   <pic:blipFill>
-                    <a:blip r:embed="rId11"/>
+                    <a:blip r:embed="rId12"/>
                     <a:stretch>
                       <a:fillRect/>
                     </a:stretch>
@@ -474,7 +474,7 @@
                     <pic:cNvPicPr/>
                   </pic:nvPicPr>
                   <pic:blipFill>
-                    <a:blip r:embed="rId12"/>
+                    <a:blip r:embed="rId13"/>
                     <a:stretch>
                       <a:fillRect/>
                     </a:stretch>
@@ -522,7 +522,7 @@
                     <pic:cNvPicPr/>
                   </pic:nvPicPr>
                   <pic:blipFill>
-                    <a:blip r:embed="rId13"/>
+                    <a:blip r:embed="rId14"/>
                     <a:stretch>
                       <a:fillRect/>
                     </a:stretch>
@@ -553,6 +553,53 @@
         <w:rPr>
           <w:lang w:val="es-419"/>
         </w:rPr>
+        <w:drawing>
+          <wp:inline distT="0" distB="0" distL="0" distR="0" wp14:anchorId="72950A6E" wp14:editId="4B51D36F">
+            <wp:extent cx="5612130" cy="1824355"/>
+            <wp:effectExtent l="0" t="0" r="7620" b="4445"/>
+            <wp:docPr id="72164387" name="Imagen 1"/>
+            <wp:cNvGraphicFramePr>
+              <a:graphicFrameLocks xmlns:a="http://schemas.openxmlformats.org/drawingml/2006/main" noChangeAspect="1"/>
+            </wp:cNvGraphicFramePr>
+            <a:graphic xmlns:a="http://schemas.openxmlformats.org/drawingml/2006/main">
+              <a:graphicData uri="http://schemas.openxmlformats.org/drawingml/2006/picture">
+                <pic:pic xmlns:pic="http://schemas.openxmlformats.org/drawingml/2006/picture">
+                  <pic:nvPicPr>
+                    <pic:cNvPr id="72164387" name=""/>
+                    <pic:cNvPicPr/>
+                  </pic:nvPicPr>
+                  <pic:blipFill>
+                    <a:blip r:embed="rId15"/>
+                    <a:stretch>
+                      <a:fillRect/>
+                    </a:stretch>
+                  </pic:blipFill>
+                  <pic:spPr>
+                    <a:xfrm>
+                      <a:off x="0" y="0"/>
+                      <a:ext cx="5612130" cy="1824355"/>
+                    </a:xfrm>
+                    <a:prstGeom prst="rect">
+                      <a:avLst/>
+                    </a:prstGeom>
+                  </pic:spPr>
+                </pic:pic>
+              </a:graphicData>
+            </a:graphic>
+          </wp:inline>
+        </w:drawing>
+      </w:r>
+    </w:p>
+    <w:p>
+      <w:pPr>
+        <w:rPr>
+          <w:lang w:val="es-419"/>
+        </w:rPr>
+      </w:pPr>
+      <w:r>
+        <w:rPr>
+          <w:lang w:val="es-419"/>
+        </w:rPr>
         <w:t>A4</w:t>
       </w:r>
     </w:p>
@@ -567,6 +614,7 @@
           <w:noProof/>
           <w:lang w:val="es-419"/>
         </w:rPr>
+        <w:lastRenderedPageBreak/>
         <w:drawing>
           <wp:inline distT="0" distB="0" distL="0" distR="0" wp14:anchorId="2CC2AB9D" wp14:editId="10BC31CE">
             <wp:extent cx="5612130" cy="1607185"/>
@@ -583,7 +631,7 @@
                     <pic:cNvPicPr/>
                   </pic:nvPicPr>
                   <pic:blipFill>
-                    <a:blip r:embed="rId14"/>
+                    <a:blip r:embed="rId16"/>
                     <a:stretch>
                       <a:fillRect/>
                     </a:stretch>
@@ -631,7 +679,7 @@
                     <pic:cNvPicPr/>
                   </pic:nvPicPr>
                   <pic:blipFill>
-                    <a:blip r:embed="rId15"/>
+                    <a:blip r:embed="rId17"/>
                     <a:stretch>
                       <a:fillRect/>
                     </a:stretch>
@@ -663,7 +711,6 @@
           <w:noProof/>
           <w:lang w:val="es-419"/>
         </w:rPr>
-        <w:lastRenderedPageBreak/>
         <w:drawing>
           <wp:inline distT="0" distB="0" distL="0" distR="0" wp14:anchorId="53444632" wp14:editId="3CB9211C">
             <wp:extent cx="5612130" cy="984250"/>
@@ -680,7 +727,7 @@
                     <pic:cNvPicPr/>
                   </pic:nvPicPr>
                   <pic:blipFill>
-                    <a:blip r:embed="rId16"/>
+                    <a:blip r:embed="rId18"/>
                     <a:stretch>
                       <a:fillRect/>
                     </a:stretch>
@@ -728,7 +775,7 @@
                     <pic:cNvPicPr/>
                   </pic:nvPicPr>
                   <pic:blipFill>
-                    <a:blip r:embed="rId17"/>
+                    <a:blip r:embed="rId19"/>
                     <a:stretch>
                       <a:fillRect/>
                     </a:stretch>
@@ -776,7 +823,7 @@
                     <pic:cNvPicPr/>
                   </pic:nvPicPr>
                   <pic:blipFill>
-                    <a:blip r:embed="rId18"/>
+                    <a:blip r:embed="rId20"/>
                     <a:stretch>
                       <a:fillRect/>
                     </a:stretch>
@@ -808,6 +855,7 @@
           <w:noProof/>
           <w:lang w:val="es-419"/>
         </w:rPr>
+        <w:lastRenderedPageBreak/>
         <w:drawing>
           <wp:inline distT="0" distB="0" distL="0" distR="0" wp14:anchorId="6C0168B5" wp14:editId="0D1AE5F0">
             <wp:extent cx="2915057" cy="2057687"/>
@@ -824,7 +872,7 @@
                     <pic:cNvPicPr/>
                   </pic:nvPicPr>
                   <pic:blipFill>
-                    <a:blip r:embed="rId19"/>
+                    <a:blip r:embed="rId21"/>
                     <a:stretch>
                       <a:fillRect/>
                     </a:stretch>
@@ -855,6 +903,20 @@
         <w:rPr>
           <w:lang w:val="es-419"/>
         </w:rPr>
+        <w:br w:type="page"/>
+      </w:r>
+    </w:p>
+    <w:p>
+      <w:pPr>
+        <w:rPr>
+          <w:lang w:val="es-419"/>
+        </w:rPr>
+      </w:pPr>
+      <w:r>
+        <w:rPr>
+          <w:lang w:val="es-419"/>
+        </w:rPr>
+        <w:lastRenderedPageBreak/>
         <w:t>A5</w:t>
       </w:r>
     </w:p>
@@ -868,6 +930,748 @@
         <w:rPr>
           <w:lang w:val="es-419"/>
         </w:rPr>
+        <w:t>- Con APP_USER_1...</w:t>
+      </w:r>
+    </w:p>
+    <w:p>
+      <w:pPr>
+        <w:rPr>
+          <w:lang w:val="es-419"/>
+        </w:rPr>
+      </w:pPr>
+      <w:r>
+        <w:rPr>
+          <w:lang w:val="es-419"/>
+        </w:rPr>
+        <w:t>o Puede hacer SELECT a las 3 tablas y a la vista</w:t>
+      </w:r>
+    </w:p>
+    <w:p>
+      <w:pPr>
+        <w:rPr>
+          <w:lang w:val="es-419"/>
+        </w:rPr>
+      </w:pPr>
+      <w:r>
+        <w:rPr>
+          <w:lang w:val="es-419"/>
+        </w:rPr>
+        <w:drawing>
+          <wp:inline distT="0" distB="0" distL="0" distR="0" wp14:anchorId="57C82267" wp14:editId="4E4AB305">
+            <wp:extent cx="4418908" cy="3525926"/>
+            <wp:effectExtent l="0" t="0" r="1270" b="0"/>
+            <wp:docPr id="1604312041" name="Imagen 1"/>
+            <wp:cNvGraphicFramePr>
+              <a:graphicFrameLocks xmlns:a="http://schemas.openxmlformats.org/drawingml/2006/main" noChangeAspect="1"/>
+            </wp:cNvGraphicFramePr>
+            <a:graphic xmlns:a="http://schemas.openxmlformats.org/drawingml/2006/main">
+              <a:graphicData uri="http://schemas.openxmlformats.org/drawingml/2006/picture">
+                <pic:pic xmlns:pic="http://schemas.openxmlformats.org/drawingml/2006/picture">
+                  <pic:nvPicPr>
+                    <pic:cNvPr id="1604312041" name=""/>
+                    <pic:cNvPicPr/>
+                  </pic:nvPicPr>
+                  <pic:blipFill>
+                    <a:blip r:embed="rId22"/>
+                    <a:stretch>
+                      <a:fillRect/>
+                    </a:stretch>
+                  </pic:blipFill>
+                  <pic:spPr>
+                    <a:xfrm>
+                      <a:off x="0" y="0"/>
+                      <a:ext cx="4418908" cy="3525926"/>
+                    </a:xfrm>
+                    <a:prstGeom prst="rect">
+                      <a:avLst/>
+                    </a:prstGeom>
+                  </pic:spPr>
+                </pic:pic>
+              </a:graphicData>
+            </a:graphic>
+          </wp:inline>
+        </w:drawing>
+      </w:r>
+    </w:p>
+    <w:p>
+      <w:pPr>
+        <w:rPr>
+          <w:lang w:val="es-419"/>
+        </w:rPr>
+      </w:pPr>
+      <w:r>
+        <w:rPr>
+          <w:lang w:val="es-419"/>
+        </w:rPr>
+        <w:drawing>
+          <wp:inline distT="0" distB="0" distL="0" distR="0" wp14:anchorId="6E332327" wp14:editId="1EDF98D4">
+            <wp:extent cx="4357941" cy="3555187"/>
+            <wp:effectExtent l="0" t="0" r="5080" b="7620"/>
+            <wp:docPr id="1864374033" name="Imagen 1"/>
+            <wp:cNvGraphicFramePr>
+              <a:graphicFrameLocks xmlns:a="http://schemas.openxmlformats.org/drawingml/2006/main" noChangeAspect="1"/>
+            </wp:cNvGraphicFramePr>
+            <a:graphic xmlns:a="http://schemas.openxmlformats.org/drawingml/2006/main">
+              <a:graphicData uri="http://schemas.openxmlformats.org/drawingml/2006/picture">
+                <pic:pic xmlns:pic="http://schemas.openxmlformats.org/drawingml/2006/picture">
+                  <pic:nvPicPr>
+                    <pic:cNvPr id="1864374033" name=""/>
+                    <pic:cNvPicPr/>
+                  </pic:nvPicPr>
+                  <pic:blipFill>
+                    <a:blip r:embed="rId23"/>
+                    <a:stretch>
+                      <a:fillRect/>
+                    </a:stretch>
+                  </pic:blipFill>
+                  <pic:spPr>
+                    <a:xfrm>
+                      <a:off x="0" y="0"/>
+                      <a:ext cx="4357941" cy="3555187"/>
+                    </a:xfrm>
+                    <a:prstGeom prst="rect">
+                      <a:avLst/>
+                    </a:prstGeom>
+                  </pic:spPr>
+                </pic:pic>
+              </a:graphicData>
+            </a:graphic>
+          </wp:inline>
+        </w:drawing>
+      </w:r>
+    </w:p>
+    <w:p>
+      <w:pPr>
+        <w:rPr>
+          <w:lang w:val="es-419"/>
+        </w:rPr>
+      </w:pPr>
+      <w:r>
+        <w:rPr>
+          <w:lang w:val="es-419"/>
+        </w:rPr>
+        <w:lastRenderedPageBreak/>
+        <w:drawing>
+          <wp:inline distT="0" distB="0" distL="0" distR="0" wp14:anchorId="04209726" wp14:editId="2E947E1A">
+            <wp:extent cx="5292264" cy="3686860"/>
+            <wp:effectExtent l="0" t="0" r="3810" b="8890"/>
+            <wp:docPr id="1563330039" name="Imagen 1"/>
+            <wp:cNvGraphicFramePr>
+              <a:graphicFrameLocks xmlns:a="http://schemas.openxmlformats.org/drawingml/2006/main" noChangeAspect="1"/>
+            </wp:cNvGraphicFramePr>
+            <a:graphic xmlns:a="http://schemas.openxmlformats.org/drawingml/2006/main">
+              <a:graphicData uri="http://schemas.openxmlformats.org/drawingml/2006/picture">
+                <pic:pic xmlns:pic="http://schemas.openxmlformats.org/drawingml/2006/picture">
+                  <pic:nvPicPr>
+                    <pic:cNvPr id="1563330039" name=""/>
+                    <pic:cNvPicPr/>
+                  </pic:nvPicPr>
+                  <pic:blipFill>
+                    <a:blip r:embed="rId24"/>
+                    <a:stretch>
+                      <a:fillRect/>
+                    </a:stretch>
+                  </pic:blipFill>
+                  <pic:spPr>
+                    <a:xfrm>
+                      <a:off x="0" y="0"/>
+                      <a:ext cx="5292264" cy="3686860"/>
+                    </a:xfrm>
+                    <a:prstGeom prst="rect">
+                      <a:avLst/>
+                    </a:prstGeom>
+                  </pic:spPr>
+                </pic:pic>
+              </a:graphicData>
+            </a:graphic>
+          </wp:inline>
+        </w:drawing>
+      </w:r>
+    </w:p>
+    <w:p>
+      <w:pPr>
+        <w:rPr>
+          <w:lang w:val="es-419"/>
+        </w:rPr>
+      </w:pPr>
+      <w:r>
+        <w:rPr>
+          <w:lang w:val="es-419"/>
+        </w:rPr>
+        <w:drawing>
+          <wp:inline distT="0" distB="0" distL="0" distR="0" wp14:anchorId="71EAEEA6" wp14:editId="061B559B">
+            <wp:extent cx="5315488" cy="3233318"/>
+            <wp:effectExtent l="0" t="0" r="0" b="5715"/>
+            <wp:docPr id="1297924136" name="Imagen 1"/>
+            <wp:cNvGraphicFramePr>
+              <a:graphicFrameLocks xmlns:a="http://schemas.openxmlformats.org/drawingml/2006/main" noChangeAspect="1"/>
+            </wp:cNvGraphicFramePr>
+            <a:graphic xmlns:a="http://schemas.openxmlformats.org/drawingml/2006/main">
+              <a:graphicData uri="http://schemas.openxmlformats.org/drawingml/2006/picture">
+                <pic:pic xmlns:pic="http://schemas.openxmlformats.org/drawingml/2006/picture">
+                  <pic:nvPicPr>
+                    <pic:cNvPr id="1297924136" name=""/>
+                    <pic:cNvPicPr/>
+                  </pic:nvPicPr>
+                  <pic:blipFill>
+                    <a:blip r:embed="rId25"/>
+                    <a:stretch>
+                      <a:fillRect/>
+                    </a:stretch>
+                  </pic:blipFill>
+                  <pic:spPr>
+                    <a:xfrm>
+                      <a:off x="0" y="0"/>
+                      <a:ext cx="5315488" cy="3233318"/>
+                    </a:xfrm>
+                    <a:prstGeom prst="rect">
+                      <a:avLst/>
+                    </a:prstGeom>
+                  </pic:spPr>
+                </pic:pic>
+              </a:graphicData>
+            </a:graphic>
+          </wp:inline>
+        </w:drawing>
+      </w:r>
+    </w:p>
+    <w:p>
+      <w:pPr>
+        <w:rPr>
+          <w:lang w:val="es-419"/>
+        </w:rPr>
+      </w:pPr>
+    </w:p>
+    <w:p>
+      <w:pPr>
+        <w:rPr>
+          <w:lang w:val="es-419"/>
+        </w:rPr>
+      </w:pPr>
+    </w:p>
+    <w:p>
+      <w:pPr>
+        <w:rPr>
+          <w:lang w:val="es-419"/>
+        </w:rPr>
+      </w:pPr>
+    </w:p>
+    <w:p>
+      <w:pPr>
+        <w:rPr>
+          <w:lang w:val="es-419"/>
+        </w:rPr>
+      </w:pPr>
+    </w:p>
+    <w:p>
+      <w:pPr>
+        <w:rPr>
+          <w:lang w:val="es-419"/>
+        </w:rPr>
+      </w:pPr>
+      <w:r>
+        <w:rPr>
+          <w:lang w:val="es-419"/>
+        </w:rPr>
+        <w:lastRenderedPageBreak/>
+        <w:t>o Intento de INSERT debe ser denegado</w:t>
+      </w:r>
+    </w:p>
+    <w:p>
+      <w:pPr>
+        <w:rPr>
+          <w:lang w:val="es-419"/>
+        </w:rPr>
+      </w:pPr>
+      <w:r>
+        <w:rPr>
+          <w:lang w:val="es-419"/>
+        </w:rPr>
+        <w:drawing>
+          <wp:inline distT="0" distB="0" distL="0" distR="0" wp14:anchorId="5B4A8E5A" wp14:editId="09F83E01">
+            <wp:extent cx="5612130" cy="2632075"/>
+            <wp:effectExtent l="0" t="0" r="7620" b="0"/>
+            <wp:docPr id="951592596" name="Imagen 1"/>
+            <wp:cNvGraphicFramePr>
+              <a:graphicFrameLocks xmlns:a="http://schemas.openxmlformats.org/drawingml/2006/main" noChangeAspect="1"/>
+            </wp:cNvGraphicFramePr>
+            <a:graphic xmlns:a="http://schemas.openxmlformats.org/drawingml/2006/main">
+              <a:graphicData uri="http://schemas.openxmlformats.org/drawingml/2006/picture">
+                <pic:pic xmlns:pic="http://schemas.openxmlformats.org/drawingml/2006/picture">
+                  <pic:nvPicPr>
+                    <pic:cNvPr id="951592596" name=""/>
+                    <pic:cNvPicPr/>
+                  </pic:nvPicPr>
+                  <pic:blipFill>
+                    <a:blip r:embed="rId26"/>
+                    <a:stretch>
+                      <a:fillRect/>
+                    </a:stretch>
+                  </pic:blipFill>
+                  <pic:spPr>
+                    <a:xfrm>
+                      <a:off x="0" y="0"/>
+                      <a:ext cx="5612130" cy="2632075"/>
+                    </a:xfrm>
+                    <a:prstGeom prst="rect">
+                      <a:avLst/>
+                    </a:prstGeom>
+                  </pic:spPr>
+                </pic:pic>
+              </a:graphicData>
+            </a:graphic>
+          </wp:inline>
+        </w:drawing>
+      </w:r>
+    </w:p>
+    <w:p>
+      <w:pPr>
+        <w:rPr>
+          <w:lang w:val="es-419"/>
+        </w:rPr>
+      </w:pPr>
+      <w:r>
+        <w:rPr>
+          <w:lang w:val="es-419"/>
+        </w:rPr>
+        <w:t>- Con APP_USER_2...</w:t>
+      </w:r>
+    </w:p>
+    <w:p>
+      <w:pPr>
+        <w:rPr>
+          <w:lang w:val="es-419"/>
+        </w:rPr>
+      </w:pPr>
+      <w:r>
+        <w:rPr>
+          <w:lang w:val="es-419"/>
+        </w:rPr>
+        <w:t>o Puede SELECT a todo</w:t>
+      </w:r>
+    </w:p>
+    <w:p>
+      <w:pPr>
+        <w:rPr>
+          <w:lang w:val="es-419"/>
+        </w:rPr>
+      </w:pPr>
+      <w:r>
+        <w:rPr>
+          <w:lang w:val="es-419"/>
+        </w:rPr>
+        <w:drawing>
+          <wp:inline distT="0" distB="0" distL="0" distR="0" wp14:anchorId="74688BF2" wp14:editId="1C1FA4A1">
+            <wp:extent cx="3723589" cy="2984601"/>
+            <wp:effectExtent l="0" t="0" r="0" b="6350"/>
+            <wp:docPr id="1444073499" name="Imagen 1"/>
+            <wp:cNvGraphicFramePr>
+              <a:graphicFrameLocks xmlns:a="http://schemas.openxmlformats.org/drawingml/2006/main" noChangeAspect="1"/>
+            </wp:cNvGraphicFramePr>
+            <a:graphic xmlns:a="http://schemas.openxmlformats.org/drawingml/2006/main">
+              <a:graphicData uri="http://schemas.openxmlformats.org/drawingml/2006/picture">
+                <pic:pic xmlns:pic="http://schemas.openxmlformats.org/drawingml/2006/picture">
+                  <pic:nvPicPr>
+                    <pic:cNvPr id="1444073499" name=""/>
+                    <pic:cNvPicPr/>
+                  </pic:nvPicPr>
+                  <pic:blipFill>
+                    <a:blip r:embed="rId27"/>
+                    <a:stretch>
+                      <a:fillRect/>
+                    </a:stretch>
+                  </pic:blipFill>
+                  <pic:spPr>
+                    <a:xfrm>
+                      <a:off x="0" y="0"/>
+                      <a:ext cx="3724571" cy="2985388"/>
+                    </a:xfrm>
+                    <a:prstGeom prst="rect">
+                      <a:avLst/>
+                    </a:prstGeom>
+                  </pic:spPr>
+                </pic:pic>
+              </a:graphicData>
+            </a:graphic>
+          </wp:inline>
+        </w:drawing>
+      </w:r>
+    </w:p>
+    <w:p>
+      <w:pPr>
+        <w:rPr>
+          <w:lang w:val="es-419"/>
+        </w:rPr>
+      </w:pPr>
+      <w:r>
+        <w:rPr>
+          <w:lang w:val="es-419"/>
+        </w:rPr>
+        <w:lastRenderedPageBreak/>
+        <w:drawing>
+          <wp:inline distT="0" distB="0" distL="0" distR="0" wp14:anchorId="3B409285" wp14:editId="4456F910">
+            <wp:extent cx="4308652" cy="3553492"/>
+            <wp:effectExtent l="0" t="0" r="0" b="8890"/>
+            <wp:docPr id="202220318" name="Imagen 1"/>
+            <wp:cNvGraphicFramePr>
+              <a:graphicFrameLocks xmlns:a="http://schemas.openxmlformats.org/drawingml/2006/main" noChangeAspect="1"/>
+            </wp:cNvGraphicFramePr>
+            <a:graphic xmlns:a="http://schemas.openxmlformats.org/drawingml/2006/main">
+              <a:graphicData uri="http://schemas.openxmlformats.org/drawingml/2006/picture">
+                <pic:pic xmlns:pic="http://schemas.openxmlformats.org/drawingml/2006/picture">
+                  <pic:nvPicPr>
+                    <pic:cNvPr id="202220318" name=""/>
+                    <pic:cNvPicPr/>
+                  </pic:nvPicPr>
+                  <pic:blipFill>
+                    <a:blip r:embed="rId28"/>
+                    <a:stretch>
+                      <a:fillRect/>
+                    </a:stretch>
+                  </pic:blipFill>
+                  <pic:spPr>
+                    <a:xfrm>
+                      <a:off x="0" y="0"/>
+                      <a:ext cx="4310700" cy="3555181"/>
+                    </a:xfrm>
+                    <a:prstGeom prst="rect">
+                      <a:avLst/>
+                    </a:prstGeom>
+                  </pic:spPr>
+                </pic:pic>
+              </a:graphicData>
+            </a:graphic>
+          </wp:inline>
+        </w:drawing>
+      </w:r>
+    </w:p>
+    <w:p>
+      <w:pPr>
+        <w:rPr>
+          <w:lang w:val="es-419"/>
+        </w:rPr>
+      </w:pPr>
+      <w:r>
+        <w:rPr>
+          <w:lang w:val="es-419"/>
+        </w:rPr>
+        <w:drawing>
+          <wp:inline distT="0" distB="0" distL="0" distR="0" wp14:anchorId="74555F52" wp14:editId="643C354B">
+            <wp:extent cx="5612130" cy="3604895"/>
+            <wp:effectExtent l="0" t="0" r="7620" b="0"/>
+            <wp:docPr id="1636571345" name="Imagen 1"/>
+            <wp:cNvGraphicFramePr>
+              <a:graphicFrameLocks xmlns:a="http://schemas.openxmlformats.org/drawingml/2006/main" noChangeAspect="1"/>
+            </wp:cNvGraphicFramePr>
+            <a:graphic xmlns:a="http://schemas.openxmlformats.org/drawingml/2006/main">
+              <a:graphicData uri="http://schemas.openxmlformats.org/drawingml/2006/picture">
+                <pic:pic xmlns:pic="http://schemas.openxmlformats.org/drawingml/2006/picture">
+                  <pic:nvPicPr>
+                    <pic:cNvPr id="1636571345" name=""/>
+                    <pic:cNvPicPr/>
+                  </pic:nvPicPr>
+                  <pic:blipFill>
+                    <a:blip r:embed="rId29"/>
+                    <a:stretch>
+                      <a:fillRect/>
+                    </a:stretch>
+                  </pic:blipFill>
+                  <pic:spPr>
+                    <a:xfrm>
+                      <a:off x="0" y="0"/>
+                      <a:ext cx="5612130" cy="3604895"/>
+                    </a:xfrm>
+                    <a:prstGeom prst="rect">
+                      <a:avLst/>
+                    </a:prstGeom>
+                  </pic:spPr>
+                </pic:pic>
+              </a:graphicData>
+            </a:graphic>
+          </wp:inline>
+        </w:drawing>
+      </w:r>
+    </w:p>
+    <w:p>
+      <w:pPr>
+        <w:rPr>
+          <w:lang w:val="es-419"/>
+        </w:rPr>
+      </w:pPr>
+      <w:r>
+        <w:rPr>
+          <w:lang w:val="es-419"/>
+        </w:rPr>
+        <w:lastRenderedPageBreak/>
+        <w:drawing>
+          <wp:inline distT="0" distB="0" distL="0" distR="0" wp14:anchorId="2BE9ADE6" wp14:editId="3056D5F6">
+            <wp:extent cx="5612130" cy="3474085"/>
+            <wp:effectExtent l="0" t="0" r="7620" b="0"/>
+            <wp:docPr id="1499945375" name="Imagen 1"/>
+            <wp:cNvGraphicFramePr>
+              <a:graphicFrameLocks xmlns:a="http://schemas.openxmlformats.org/drawingml/2006/main" noChangeAspect="1"/>
+            </wp:cNvGraphicFramePr>
+            <a:graphic xmlns:a="http://schemas.openxmlformats.org/drawingml/2006/main">
+              <a:graphicData uri="http://schemas.openxmlformats.org/drawingml/2006/picture">
+                <pic:pic xmlns:pic="http://schemas.openxmlformats.org/drawingml/2006/picture">
+                  <pic:nvPicPr>
+                    <pic:cNvPr id="1499945375" name=""/>
+                    <pic:cNvPicPr/>
+                  </pic:nvPicPr>
+                  <pic:blipFill>
+                    <a:blip r:embed="rId30"/>
+                    <a:stretch>
+                      <a:fillRect/>
+                    </a:stretch>
+                  </pic:blipFill>
+                  <pic:spPr>
+                    <a:xfrm>
+                      <a:off x="0" y="0"/>
+                      <a:ext cx="5612130" cy="3474085"/>
+                    </a:xfrm>
+                    <a:prstGeom prst="rect">
+                      <a:avLst/>
+                    </a:prstGeom>
+                  </pic:spPr>
+                </pic:pic>
+              </a:graphicData>
+            </a:graphic>
+          </wp:inline>
+        </w:drawing>
+      </w:r>
+    </w:p>
+    <w:p>
+      <w:pPr>
+        <w:rPr>
+          <w:lang w:val="es-419"/>
+        </w:rPr>
+      </w:pPr>
+      <w:r>
+        <w:rPr>
+          <w:lang w:val="es-419"/>
+        </w:rPr>
+        <w:t xml:space="preserve">o Puede INSERT solo en </w:t>
+      </w:r>
+      <w:r>
+        <w:rPr>
+          <w:lang w:val="es-419"/>
+        </w:rPr>
+        <w:t>MOV</w:t>
+      </w:r>
+    </w:p>
+    <w:p>
+      <w:pPr>
+        <w:rPr>
+          <w:lang w:val="es-419"/>
+        </w:rPr>
+      </w:pPr>
+      <w:r>
+        <w:rPr>
+          <w:lang w:val="es-419"/>
+        </w:rPr>
+        <w:drawing>
+          <wp:inline distT="0" distB="0" distL="0" distR="0" wp14:anchorId="7F9EB65E" wp14:editId="66BDEB4C">
+            <wp:extent cx="5612130" cy="2548255"/>
+            <wp:effectExtent l="0" t="0" r="7620" b="4445"/>
+            <wp:docPr id="468199511" name="Imagen 1"/>
+            <wp:cNvGraphicFramePr>
+              <a:graphicFrameLocks xmlns:a="http://schemas.openxmlformats.org/drawingml/2006/main" noChangeAspect="1"/>
+            </wp:cNvGraphicFramePr>
+            <a:graphic xmlns:a="http://schemas.openxmlformats.org/drawingml/2006/main">
+              <a:graphicData uri="http://schemas.openxmlformats.org/drawingml/2006/picture">
+                <pic:pic xmlns:pic="http://schemas.openxmlformats.org/drawingml/2006/picture">
+                  <pic:nvPicPr>
+                    <pic:cNvPr id="468199511" name=""/>
+                    <pic:cNvPicPr/>
+                  </pic:nvPicPr>
+                  <pic:blipFill>
+                    <a:blip r:embed="rId31"/>
+                    <a:stretch>
+                      <a:fillRect/>
+                    </a:stretch>
+                  </pic:blipFill>
+                  <pic:spPr>
+                    <a:xfrm>
+                      <a:off x="0" y="0"/>
+                      <a:ext cx="5612130" cy="2548255"/>
+                    </a:xfrm>
+                    <a:prstGeom prst="rect">
+                      <a:avLst/>
+                    </a:prstGeom>
+                  </pic:spPr>
+                </pic:pic>
+              </a:graphicData>
+            </a:graphic>
+          </wp:inline>
+        </w:drawing>
+      </w:r>
+    </w:p>
+    <w:p>
+      <w:pPr>
+        <w:rPr>
+          <w:lang w:val="es-419"/>
+        </w:rPr>
+      </w:pPr>
+      <w:r>
+        <w:rPr>
+          <w:lang w:val="es-419"/>
+        </w:rPr>
+        <w:lastRenderedPageBreak/>
+        <w:drawing>
+          <wp:inline distT="0" distB="0" distL="0" distR="0" wp14:anchorId="2DD15AC7" wp14:editId="4D5977F1">
+            <wp:extent cx="5612130" cy="2064385"/>
+            <wp:effectExtent l="0" t="0" r="7620" b="0"/>
+            <wp:docPr id="286155601" name="Imagen 1"/>
+            <wp:cNvGraphicFramePr>
+              <a:graphicFrameLocks xmlns:a="http://schemas.openxmlformats.org/drawingml/2006/main" noChangeAspect="1"/>
+            </wp:cNvGraphicFramePr>
+            <a:graphic xmlns:a="http://schemas.openxmlformats.org/drawingml/2006/main">
+              <a:graphicData uri="http://schemas.openxmlformats.org/drawingml/2006/picture">
+                <pic:pic xmlns:pic="http://schemas.openxmlformats.org/drawingml/2006/picture">
+                  <pic:nvPicPr>
+                    <pic:cNvPr id="286155601" name=""/>
+                    <pic:cNvPicPr/>
+                  </pic:nvPicPr>
+                  <pic:blipFill>
+                    <a:blip r:embed="rId32"/>
+                    <a:stretch>
+                      <a:fillRect/>
+                    </a:stretch>
+                  </pic:blipFill>
+                  <pic:spPr>
+                    <a:xfrm>
+                      <a:off x="0" y="0"/>
+                      <a:ext cx="5612130" cy="2064385"/>
+                    </a:xfrm>
+                    <a:prstGeom prst="rect">
+                      <a:avLst/>
+                    </a:prstGeom>
+                  </pic:spPr>
+                </pic:pic>
+              </a:graphicData>
+            </a:graphic>
+          </wp:inline>
+        </w:drawing>
+      </w:r>
+    </w:p>
+    <w:p>
+      <w:pPr>
+        <w:rPr>
+          <w:lang w:val="es-419"/>
+        </w:rPr>
+      </w:pPr>
+      <w:r>
+        <w:rPr>
+          <w:lang w:val="es-419"/>
+        </w:rPr>
+        <w:t>o Intento de DROP TABLE o crear usuarios/roles debe ser denegado</w:t>
+      </w:r>
+    </w:p>
+    <w:p>
+      <w:pPr>
+        <w:rPr>
+          <w:lang w:val="es-419"/>
+        </w:rPr>
+      </w:pPr>
+      <w:r>
+        <w:rPr>
+          <w:lang w:val="es-419"/>
+        </w:rPr>
+        <w:drawing>
+          <wp:inline distT="0" distB="0" distL="0" distR="0" wp14:anchorId="1B5D6B8A" wp14:editId="32870C74">
+            <wp:extent cx="4592292" cy="3299155"/>
+            <wp:effectExtent l="0" t="0" r="0" b="0"/>
+            <wp:docPr id="322193328" name="Imagen 1"/>
+            <wp:cNvGraphicFramePr>
+              <a:graphicFrameLocks xmlns:a="http://schemas.openxmlformats.org/drawingml/2006/main" noChangeAspect="1"/>
+            </wp:cNvGraphicFramePr>
+            <a:graphic xmlns:a="http://schemas.openxmlformats.org/drawingml/2006/main">
+              <a:graphicData uri="http://schemas.openxmlformats.org/drawingml/2006/picture">
+                <pic:pic xmlns:pic="http://schemas.openxmlformats.org/drawingml/2006/picture">
+                  <pic:nvPicPr>
+                    <pic:cNvPr id="322193328" name=""/>
+                    <pic:cNvPicPr/>
+                  </pic:nvPicPr>
+                  <pic:blipFill>
+                    <a:blip r:embed="rId33"/>
+                    <a:stretch>
+                      <a:fillRect/>
+                    </a:stretch>
+                  </pic:blipFill>
+                  <pic:spPr>
+                    <a:xfrm>
+                      <a:off x="0" y="0"/>
+                      <a:ext cx="4594234" cy="3300550"/>
+                    </a:xfrm>
+                    <a:prstGeom prst="rect">
+                      <a:avLst/>
+                    </a:prstGeom>
+                  </pic:spPr>
+                </pic:pic>
+              </a:graphicData>
+            </a:graphic>
+          </wp:inline>
+        </w:drawing>
+      </w:r>
+    </w:p>
+    <w:p>
+      <w:pPr>
+        <w:rPr>
+          <w:lang w:val="es-419"/>
+        </w:rPr>
+      </w:pPr>
+      <w:r>
+        <w:rPr>
+          <w:lang w:val="es-419"/>
+        </w:rPr>
+        <w:lastRenderedPageBreak/>
+        <w:drawing>
+          <wp:inline distT="0" distB="0" distL="0" distR="0" wp14:anchorId="775CBE41" wp14:editId="768FB3EB">
+            <wp:extent cx="4208100" cy="2655417"/>
+            <wp:effectExtent l="0" t="0" r="2540" b="0"/>
+            <wp:docPr id="1652790580" name="Imagen 1"/>
+            <wp:cNvGraphicFramePr>
+              <a:graphicFrameLocks xmlns:a="http://schemas.openxmlformats.org/drawingml/2006/main" noChangeAspect="1"/>
+            </wp:cNvGraphicFramePr>
+            <a:graphic xmlns:a="http://schemas.openxmlformats.org/drawingml/2006/main">
+              <a:graphicData uri="http://schemas.openxmlformats.org/drawingml/2006/picture">
+                <pic:pic xmlns:pic="http://schemas.openxmlformats.org/drawingml/2006/picture">
+                  <pic:nvPicPr>
+                    <pic:cNvPr id="1652790580" name=""/>
+                    <pic:cNvPicPr/>
+                  </pic:nvPicPr>
+                  <pic:blipFill>
+                    <a:blip r:embed="rId34"/>
+                    <a:stretch>
+                      <a:fillRect/>
+                    </a:stretch>
+                  </pic:blipFill>
+                  <pic:spPr>
+                    <a:xfrm>
+                      <a:off x="0" y="0"/>
+                      <a:ext cx="4210038" cy="2656640"/>
+                    </a:xfrm>
+                    <a:prstGeom prst="rect">
+                      <a:avLst/>
+                    </a:prstGeom>
+                  </pic:spPr>
+                </pic:pic>
+              </a:graphicData>
+            </a:graphic>
+          </wp:inline>
+        </w:drawing>
+      </w:r>
+    </w:p>
+    <w:p>
+      <w:pPr>
+        <w:rPr>
+          <w:lang w:val="es-419"/>
+        </w:rPr>
+      </w:pPr>
+      <w:r>
+        <w:rPr>
+          <w:lang w:val="es-419"/>
+        </w:rPr>
         <w:br w:type="page"/>
       </w:r>
     </w:p>
@@ -882,6 +1686,329 @@
           <w:lang w:val="es-419"/>
         </w:rPr>
         <w:lastRenderedPageBreak/>
+        <w:t>- Con AUDITOR...</w:t>
+      </w:r>
+    </w:p>
+    <w:p>
+      <w:pPr>
+        <w:rPr>
+          <w:lang w:val="es-419"/>
+        </w:rPr>
+      </w:pPr>
+      <w:r>
+        <w:rPr>
+          <w:lang w:val="es-419"/>
+        </w:rPr>
+        <w:t>o Puede consultar lo necesario para auditoría/logs</w:t>
+      </w:r>
+    </w:p>
+    <w:p>
+      <w:pPr>
+        <w:rPr>
+          <w:lang w:val="es-419"/>
+        </w:rPr>
+      </w:pPr>
+      <w:r>
+        <w:rPr>
+          <w:lang w:val="es-419"/>
+        </w:rPr>
+        <w:drawing>
+          <wp:inline distT="0" distB="0" distL="0" distR="0" wp14:anchorId="185A01D1" wp14:editId="3EBBE0F1">
+            <wp:extent cx="5612130" cy="4265295"/>
+            <wp:effectExtent l="0" t="0" r="7620" b="1905"/>
+            <wp:docPr id="571539943" name="Imagen 1"/>
+            <wp:cNvGraphicFramePr>
+              <a:graphicFrameLocks xmlns:a="http://schemas.openxmlformats.org/drawingml/2006/main" noChangeAspect="1"/>
+            </wp:cNvGraphicFramePr>
+            <a:graphic xmlns:a="http://schemas.openxmlformats.org/drawingml/2006/main">
+              <a:graphicData uri="http://schemas.openxmlformats.org/drawingml/2006/picture">
+                <pic:pic xmlns:pic="http://schemas.openxmlformats.org/drawingml/2006/picture">
+                  <pic:nvPicPr>
+                    <pic:cNvPr id="571539943" name=""/>
+                    <pic:cNvPicPr/>
+                  </pic:nvPicPr>
+                  <pic:blipFill>
+                    <a:blip r:embed="rId35"/>
+                    <a:stretch>
+                      <a:fillRect/>
+                    </a:stretch>
+                  </pic:blipFill>
+                  <pic:spPr>
+                    <a:xfrm>
+                      <a:off x="0" y="0"/>
+                      <a:ext cx="5612130" cy="4265295"/>
+                    </a:xfrm>
+                    <a:prstGeom prst="rect">
+                      <a:avLst/>
+                    </a:prstGeom>
+                  </pic:spPr>
+                </pic:pic>
+              </a:graphicData>
+            </a:graphic>
+          </wp:inline>
+        </w:drawing>
+      </w:r>
+    </w:p>
+    <w:p>
+      <w:pPr>
+        <w:rPr>
+          <w:lang w:val="es-419"/>
+        </w:rPr>
+      </w:pPr>
+      <w:r>
+        <w:rPr>
+          <w:lang w:val="es-419"/>
+        </w:rPr>
+        <w:drawing>
+          <wp:inline distT="0" distB="0" distL="0" distR="0" wp14:anchorId="6CBC9F34" wp14:editId="301D0085">
+            <wp:extent cx="5612130" cy="3216910"/>
+            <wp:effectExtent l="0" t="0" r="7620" b="2540"/>
+            <wp:docPr id="1049188686" name="Imagen 1"/>
+            <wp:cNvGraphicFramePr>
+              <a:graphicFrameLocks xmlns:a="http://schemas.openxmlformats.org/drawingml/2006/main" noChangeAspect="1"/>
+            </wp:cNvGraphicFramePr>
+            <a:graphic xmlns:a="http://schemas.openxmlformats.org/drawingml/2006/main">
+              <a:graphicData uri="http://schemas.openxmlformats.org/drawingml/2006/picture">
+                <pic:pic xmlns:pic="http://schemas.openxmlformats.org/drawingml/2006/picture">
+                  <pic:nvPicPr>
+                    <pic:cNvPr id="1049188686" name=""/>
+                    <pic:cNvPicPr/>
+                  </pic:nvPicPr>
+                  <pic:blipFill>
+                    <a:blip r:embed="rId36"/>
+                    <a:stretch>
+                      <a:fillRect/>
+                    </a:stretch>
+                  </pic:blipFill>
+                  <pic:spPr>
+                    <a:xfrm>
+                      <a:off x="0" y="0"/>
+                      <a:ext cx="5612130" cy="3216910"/>
+                    </a:xfrm>
+                    <a:prstGeom prst="rect">
+                      <a:avLst/>
+                    </a:prstGeom>
+                  </pic:spPr>
+                </pic:pic>
+              </a:graphicData>
+            </a:graphic>
+          </wp:inline>
+        </w:drawing>
+      </w:r>
+    </w:p>
+    <w:p>
+      <w:pPr>
+        <w:rPr>
+          <w:lang w:val="es-419"/>
+        </w:rPr>
+      </w:pPr>
+      <w:r>
+        <w:rPr>
+          <w:lang w:val="es-419"/>
+        </w:rPr>
+        <w:lastRenderedPageBreak/>
+        <w:drawing>
+          <wp:inline distT="0" distB="0" distL="0" distR="0" wp14:anchorId="7C7384D8" wp14:editId="0E339D3F">
+            <wp:extent cx="5612130" cy="4013200"/>
+            <wp:effectExtent l="0" t="0" r="7620" b="6350"/>
+            <wp:docPr id="1592488523" name="Imagen 1"/>
+            <wp:cNvGraphicFramePr>
+              <a:graphicFrameLocks xmlns:a="http://schemas.openxmlformats.org/drawingml/2006/main" noChangeAspect="1"/>
+            </wp:cNvGraphicFramePr>
+            <a:graphic xmlns:a="http://schemas.openxmlformats.org/drawingml/2006/main">
+              <a:graphicData uri="http://schemas.openxmlformats.org/drawingml/2006/picture">
+                <pic:pic xmlns:pic="http://schemas.openxmlformats.org/drawingml/2006/picture">
+                  <pic:nvPicPr>
+                    <pic:cNvPr id="1592488523" name=""/>
+                    <pic:cNvPicPr/>
+                  </pic:nvPicPr>
+                  <pic:blipFill>
+                    <a:blip r:embed="rId37"/>
+                    <a:stretch>
+                      <a:fillRect/>
+                    </a:stretch>
+                  </pic:blipFill>
+                  <pic:spPr>
+                    <a:xfrm>
+                      <a:off x="0" y="0"/>
+                      <a:ext cx="5612130" cy="4013200"/>
+                    </a:xfrm>
+                    <a:prstGeom prst="rect">
+                      <a:avLst/>
+                    </a:prstGeom>
+                  </pic:spPr>
+                </pic:pic>
+              </a:graphicData>
+            </a:graphic>
+          </wp:inline>
+        </w:drawing>
+      </w:r>
+    </w:p>
+    <w:p>
+      <w:pPr>
+        <w:rPr>
+          <w:lang w:val="es-419"/>
+        </w:rPr>
+      </w:pPr>
+      <w:r>
+        <w:rPr>
+          <w:lang w:val="es-419"/>
+        </w:rPr>
+        <w:t>o No puede modificar datos de negocio (INSERT/UPDATE/DELETE) (debe quedar denegado)</w:t>
+      </w:r>
+    </w:p>
+    <w:p>
+      <w:pPr>
+        <w:rPr>
+          <w:lang w:val="es-419"/>
+        </w:rPr>
+      </w:pPr>
+      <w:r>
+        <w:rPr>
+          <w:lang w:val="es-419"/>
+        </w:rPr>
+        <w:drawing>
+          <wp:inline distT="0" distB="0" distL="0" distR="0" wp14:anchorId="4E2DFC8D" wp14:editId="695B6836">
+            <wp:extent cx="5612130" cy="2521585"/>
+            <wp:effectExtent l="0" t="0" r="7620" b="0"/>
+            <wp:docPr id="130182032" name="Imagen 1"/>
+            <wp:cNvGraphicFramePr>
+              <a:graphicFrameLocks xmlns:a="http://schemas.openxmlformats.org/drawingml/2006/main" noChangeAspect="1"/>
+            </wp:cNvGraphicFramePr>
+            <a:graphic xmlns:a="http://schemas.openxmlformats.org/drawingml/2006/main">
+              <a:graphicData uri="http://schemas.openxmlformats.org/drawingml/2006/picture">
+                <pic:pic xmlns:pic="http://schemas.openxmlformats.org/drawingml/2006/picture">
+                  <pic:nvPicPr>
+                    <pic:cNvPr id="130182032" name=""/>
+                    <pic:cNvPicPr/>
+                  </pic:nvPicPr>
+                  <pic:blipFill>
+                    <a:blip r:embed="rId38"/>
+                    <a:stretch>
+                      <a:fillRect/>
+                    </a:stretch>
+                  </pic:blipFill>
+                  <pic:spPr>
+                    <a:xfrm>
+                      <a:off x="0" y="0"/>
+                      <a:ext cx="5612130" cy="2521585"/>
+                    </a:xfrm>
+                    <a:prstGeom prst="rect">
+                      <a:avLst/>
+                    </a:prstGeom>
+                  </pic:spPr>
+                </pic:pic>
+              </a:graphicData>
+            </a:graphic>
+          </wp:inline>
+        </w:drawing>
+      </w:r>
+    </w:p>
+    <w:p>
+      <w:pPr>
+        <w:rPr>
+          <w:lang w:val="es-419"/>
+        </w:rPr>
+      </w:pPr>
+      <w:r>
+        <w:rPr>
+          <w:lang w:val="es-419"/>
+        </w:rPr>
+        <w:lastRenderedPageBreak/>
+        <w:drawing>
+          <wp:inline distT="0" distB="0" distL="0" distR="0" wp14:anchorId="03BB8757" wp14:editId="4E1CED7B">
+            <wp:extent cx="5612130" cy="2385695"/>
+            <wp:effectExtent l="0" t="0" r="7620" b="0"/>
+            <wp:docPr id="163521981" name="Imagen 1"/>
+            <wp:cNvGraphicFramePr>
+              <a:graphicFrameLocks xmlns:a="http://schemas.openxmlformats.org/drawingml/2006/main" noChangeAspect="1"/>
+            </wp:cNvGraphicFramePr>
+            <a:graphic xmlns:a="http://schemas.openxmlformats.org/drawingml/2006/main">
+              <a:graphicData uri="http://schemas.openxmlformats.org/drawingml/2006/picture">
+                <pic:pic xmlns:pic="http://schemas.openxmlformats.org/drawingml/2006/picture">
+                  <pic:nvPicPr>
+                    <pic:cNvPr id="163521981" name=""/>
+                    <pic:cNvPicPr/>
+                  </pic:nvPicPr>
+                  <pic:blipFill>
+                    <a:blip r:embed="rId39"/>
+                    <a:stretch>
+                      <a:fillRect/>
+                    </a:stretch>
+                  </pic:blipFill>
+                  <pic:spPr>
+                    <a:xfrm>
+                      <a:off x="0" y="0"/>
+                      <a:ext cx="5612130" cy="2385695"/>
+                    </a:xfrm>
+                    <a:prstGeom prst="rect">
+                      <a:avLst/>
+                    </a:prstGeom>
+                  </pic:spPr>
+                </pic:pic>
+              </a:graphicData>
+            </a:graphic>
+          </wp:inline>
+        </w:drawing>
+      </w:r>
+    </w:p>
+    <w:p>
+      <w:pPr>
+        <w:rPr>
+          <w:lang w:val="es-419"/>
+        </w:rPr>
+      </w:pPr>
+      <w:r>
+        <w:rPr>
+          <w:lang w:val="es-419"/>
+        </w:rPr>
+        <w:drawing>
+          <wp:inline distT="0" distB="0" distL="0" distR="0" wp14:anchorId="575CBB16" wp14:editId="0D1ED33C">
+            <wp:extent cx="5612130" cy="3099435"/>
+            <wp:effectExtent l="0" t="0" r="7620" b="5715"/>
+            <wp:docPr id="1466937108" name="Imagen 1"/>
+            <wp:cNvGraphicFramePr>
+              <a:graphicFrameLocks xmlns:a="http://schemas.openxmlformats.org/drawingml/2006/main" noChangeAspect="1"/>
+            </wp:cNvGraphicFramePr>
+            <a:graphic xmlns:a="http://schemas.openxmlformats.org/drawingml/2006/main">
+              <a:graphicData uri="http://schemas.openxmlformats.org/drawingml/2006/picture">
+                <pic:pic xmlns:pic="http://schemas.openxmlformats.org/drawingml/2006/picture">
+                  <pic:nvPicPr>
+                    <pic:cNvPr id="1466937108" name=""/>
+                    <pic:cNvPicPr/>
+                  </pic:nvPicPr>
+                  <pic:blipFill>
+                    <a:blip r:embed="rId40"/>
+                    <a:stretch>
+                      <a:fillRect/>
+                    </a:stretch>
+                  </pic:blipFill>
+                  <pic:spPr>
+                    <a:xfrm>
+                      <a:off x="0" y="0"/>
+                      <a:ext cx="5612130" cy="3099435"/>
+                    </a:xfrm>
+                    <a:prstGeom prst="rect">
+                      <a:avLst/>
+                    </a:prstGeom>
+                  </pic:spPr>
+                </pic:pic>
+              </a:graphicData>
+            </a:graphic>
+          </wp:inline>
+        </w:drawing>
+      </w:r>
+    </w:p>
+    <w:p>
+      <w:pPr>
+        <w:rPr>
+          <w:lang w:val="es-419"/>
+        </w:rPr>
+      </w:pPr>
+      <w:r>
+        <w:rPr>
+          <w:lang w:val="es-419"/>
+        </w:rPr>
         <w:t>B3</w:t>
       </w:r>
     </w:p>
@@ -896,6 +2023,7 @@
           <w:noProof/>
           <w:lang w:val="es-419"/>
         </w:rPr>
+        <w:lastRenderedPageBreak/>
         <w:drawing>
           <wp:inline distT="0" distB="0" distL="0" distR="0" wp14:anchorId="21CF07DA" wp14:editId="3217A6C8">
             <wp:extent cx="5610860" cy="5939790"/>
@@ -914,7 +2042,7 @@
                     </pic:cNvPicPr>
                   </pic:nvPicPr>
                   <pic:blipFill>
-                    <a:blip r:embed="rId20">
+                    <a:blip r:embed="rId41">
                       <a:extLst>
                         <a:ext uri="{28A0092B-C50C-407E-A947-70E740481C1C}">
                           <a14:useLocalDpi xmlns:a14="http://schemas.microsoft.com/office/drawing/2010/main" val="0"/>
@@ -957,7 +2085,6 @@
           <w:noProof/>
           <w:lang w:val="es-419"/>
         </w:rPr>
-        <w:lastRenderedPageBreak/>
         <w:drawing>
           <wp:inline distT="0" distB="0" distL="0" distR="0" wp14:anchorId="2EDE852A" wp14:editId="0E24F7C4">
             <wp:extent cx="5610860" cy="2099310"/>
@@ -976,7 +2103,7 @@
                     </pic:cNvPicPr>
                   </pic:nvPicPr>
                   <pic:blipFill>
-                    <a:blip r:embed="rId21">
+                    <a:blip r:embed="rId42">
                       <a:extLst>
                         <a:ext uri="{28A0092B-C50C-407E-A947-70E740481C1C}">
                           <a14:useLocalDpi xmlns:a14="http://schemas.microsoft.com/office/drawing/2010/main" val="0"/>
@@ -1016,6 +2143,467 @@
     </w:sectPr>
   </w:body>
 </w:document>
+</file>
+
+<file path=word/numbering.xml><?xml version="1.0" encoding="utf-8"?>
+<w:numbering xmlns:wpc="http://schemas.microsoft.com/office/word/2010/wordprocessingCanvas" xmlns:cx="http://schemas.microsoft.com/office/drawing/2014/chartex" xmlns:cx1="http://schemas.microsoft.com/office/drawing/2015/9/8/chartex" xmlns:cx2="http://schemas.microsoft.com/office/drawing/2015/10/21/chartex" xmlns:cx3="http://schemas.microsoft.com/office/drawing/2016/5/9/chartex" xmlns:cx4="http://schemas.microsoft.com/office/drawing/2016/5/10/chartex" xmlns:cx5="http://schemas.microsoft.com/office/drawing/2016/5/11/chartex" xmlns:cx6="http://schemas.microsoft.com/office/drawing/2016/5/12/chartex" xmlns:cx7="http://schemas.microsoft.com/office/drawing/2016/5/13/chartex" xmlns:cx8="http://schemas.microsoft.com/office/drawing/2016/5/14/chartex" xmlns:mc="http://schemas.openxmlformats.org/markup-compatibility/2006" xmlns:aink="http://schemas.microsoft.com/office/drawing/2016/ink" xmlns:am3d="http://schemas.microsoft.com/office/drawing/2017/model3d" xmlns:o="urn:schemas-microsoft-com:office:office" xmlns:oel="http://schemas.microsoft.com/office/2019/extlst" xmlns:r="http://schemas.openxmlformats.org/officeDocument/2006/relationships" xmlns:m="http://schemas.openxmlformats.org/officeDocument/2006/math" xmlns:v="urn:schemas-microsoft-com:vml" xmlns:wp14="http://schemas.microsoft.com/office/word/2010/wordprocessingDrawing" xmlns:wp="http://schemas.openxmlformats.org/drawingml/2006/wordprocessingDrawing" xmlns:w10="urn:schemas-microsoft-com:office:word" xmlns:w="http://schemas.openxmlformats.org/wordprocessingml/2006/main" xmlns:w14="http://schemas.microsoft.com/office/word/2010/wordml" xmlns:w15="http://schemas.microsoft.com/office/word/2012/wordml" xmlns:w16cex="http://schemas.microsoft.com/office/word/2018/wordml/cex" xmlns:w16cid="http://schemas.microsoft.com/office/word/2016/wordml/cid" xmlns:w16="http://schemas.microsoft.com/office/word/2018/wordml" xmlns:w16du="http://schemas.microsoft.com/office/word/2023/wordml/word16du" xmlns:w16sdtdh="http://schemas.microsoft.com/office/word/2020/wordml/sdtdatahash" xmlns:w16sdtfl="http://schemas.microsoft.com/office/word/2024/wordml/sdtformatlock" xmlns:w16se="http://schemas.microsoft.com/office/word/2015/wordml/symex" xmlns:wpg="http://schemas.microsoft.com/office/word/2010/wordprocessingGroup" xmlns:wpi="http://schemas.microsoft.com/office/word/2010/wordprocessingInk" xmlns:wne="http://schemas.microsoft.com/office/word/2006/wordml" xmlns:wps="http://schemas.microsoft.com/office/word/2010/wordprocessingShape" mc:Ignorable="w14 w15 w16se w16cid w16 w16cex w16sdtdh w16sdtfl w16du wp14">
+  <w:abstractNum w:abstractNumId="0" w15:restartNumberingAfterBreak="0">
+    <w:nsid w:val="14E53B75"/>
+    <w:multiLevelType w:val="multilevel"/>
+    <w:tmpl w:val="72C20B74"/>
+    <w:lvl w:ilvl="0">
+      <w:start w:val="1"/>
+      <w:numFmt w:val="bullet"/>
+      <w:lvlText w:val=""/>
+      <w:lvlJc w:val="left"/>
+      <w:pPr>
+        <w:tabs>
+          <w:tab w:val="num" w:pos="720"/>
+        </w:tabs>
+        <w:ind w:left="720" w:hanging="360"/>
+      </w:pPr>
+      <w:rPr>
+        <w:rFonts w:ascii="Symbol" w:hAnsi="Symbol" w:hint="default"/>
+        <w:sz w:val="20"/>
+      </w:rPr>
+    </w:lvl>
+    <w:lvl w:ilvl="1" w:tentative="1">
+      <w:start w:val="1"/>
+      <w:numFmt w:val="bullet"/>
+      <w:lvlText w:val="o"/>
+      <w:lvlJc w:val="left"/>
+      <w:pPr>
+        <w:tabs>
+          <w:tab w:val="num" w:pos="1440"/>
+        </w:tabs>
+        <w:ind w:left="1440" w:hanging="360"/>
+      </w:pPr>
+      <w:rPr>
+        <w:rFonts w:ascii="Courier New" w:hAnsi="Courier New" w:hint="default"/>
+        <w:sz w:val="20"/>
+      </w:rPr>
+    </w:lvl>
+    <w:lvl w:ilvl="2" w:tentative="1">
+      <w:start w:val="1"/>
+      <w:numFmt w:val="bullet"/>
+      <w:lvlText w:val=""/>
+      <w:lvlJc w:val="left"/>
+      <w:pPr>
+        <w:tabs>
+          <w:tab w:val="num" w:pos="2160"/>
+        </w:tabs>
+        <w:ind w:left="2160" w:hanging="360"/>
+      </w:pPr>
+      <w:rPr>
+        <w:rFonts w:ascii="Wingdings" w:hAnsi="Wingdings" w:hint="default"/>
+        <w:sz w:val="20"/>
+      </w:rPr>
+    </w:lvl>
+    <w:lvl w:ilvl="3" w:tentative="1">
+      <w:start w:val="1"/>
+      <w:numFmt w:val="bullet"/>
+      <w:lvlText w:val=""/>
+      <w:lvlJc w:val="left"/>
+      <w:pPr>
+        <w:tabs>
+          <w:tab w:val="num" w:pos="2880"/>
+        </w:tabs>
+        <w:ind w:left="2880" w:hanging="360"/>
+      </w:pPr>
+      <w:rPr>
+        <w:rFonts w:ascii="Wingdings" w:hAnsi="Wingdings" w:hint="default"/>
+        <w:sz w:val="20"/>
+      </w:rPr>
+    </w:lvl>
+    <w:lvl w:ilvl="4" w:tentative="1">
+      <w:start w:val="1"/>
+      <w:numFmt w:val="bullet"/>
+      <w:lvlText w:val=""/>
+      <w:lvlJc w:val="left"/>
+      <w:pPr>
+        <w:tabs>
+          <w:tab w:val="num" w:pos="3600"/>
+        </w:tabs>
+        <w:ind w:left="3600" w:hanging="360"/>
+      </w:pPr>
+      <w:rPr>
+        <w:rFonts w:ascii="Wingdings" w:hAnsi="Wingdings" w:hint="default"/>
+        <w:sz w:val="20"/>
+      </w:rPr>
+    </w:lvl>
+    <w:lvl w:ilvl="5" w:tentative="1">
+      <w:start w:val="1"/>
+      <w:numFmt w:val="bullet"/>
+      <w:lvlText w:val=""/>
+      <w:lvlJc w:val="left"/>
+      <w:pPr>
+        <w:tabs>
+          <w:tab w:val="num" w:pos="4320"/>
+        </w:tabs>
+        <w:ind w:left="4320" w:hanging="360"/>
+      </w:pPr>
+      <w:rPr>
+        <w:rFonts w:ascii="Wingdings" w:hAnsi="Wingdings" w:hint="default"/>
+        <w:sz w:val="20"/>
+      </w:rPr>
+    </w:lvl>
+    <w:lvl w:ilvl="6" w:tentative="1">
+      <w:start w:val="1"/>
+      <w:numFmt w:val="bullet"/>
+      <w:lvlText w:val=""/>
+      <w:lvlJc w:val="left"/>
+      <w:pPr>
+        <w:tabs>
+          <w:tab w:val="num" w:pos="5040"/>
+        </w:tabs>
+        <w:ind w:left="5040" w:hanging="360"/>
+      </w:pPr>
+      <w:rPr>
+        <w:rFonts w:ascii="Wingdings" w:hAnsi="Wingdings" w:hint="default"/>
+        <w:sz w:val="20"/>
+      </w:rPr>
+    </w:lvl>
+    <w:lvl w:ilvl="7" w:tentative="1">
+      <w:start w:val="1"/>
+      <w:numFmt w:val="bullet"/>
+      <w:lvlText w:val=""/>
+      <w:lvlJc w:val="left"/>
+      <w:pPr>
+        <w:tabs>
+          <w:tab w:val="num" w:pos="5760"/>
+        </w:tabs>
+        <w:ind w:left="5760" w:hanging="360"/>
+      </w:pPr>
+      <w:rPr>
+        <w:rFonts w:ascii="Wingdings" w:hAnsi="Wingdings" w:hint="default"/>
+        <w:sz w:val="20"/>
+      </w:rPr>
+    </w:lvl>
+    <w:lvl w:ilvl="8" w:tentative="1">
+      <w:start w:val="1"/>
+      <w:numFmt w:val="bullet"/>
+      <w:lvlText w:val=""/>
+      <w:lvlJc w:val="left"/>
+      <w:pPr>
+        <w:tabs>
+          <w:tab w:val="num" w:pos="6480"/>
+        </w:tabs>
+        <w:ind w:left="6480" w:hanging="360"/>
+      </w:pPr>
+      <w:rPr>
+        <w:rFonts w:ascii="Wingdings" w:hAnsi="Wingdings" w:hint="default"/>
+        <w:sz w:val="20"/>
+      </w:rPr>
+    </w:lvl>
+  </w:abstractNum>
+  <w:abstractNum w:abstractNumId="1" w15:restartNumberingAfterBreak="0">
+    <w:nsid w:val="3FAC61F3"/>
+    <w:multiLevelType w:val="multilevel"/>
+    <w:tmpl w:val="EE4ED870"/>
+    <w:lvl w:ilvl="0">
+      <w:start w:val="1"/>
+      <w:numFmt w:val="bullet"/>
+      <w:lvlText w:val=""/>
+      <w:lvlJc w:val="left"/>
+      <w:pPr>
+        <w:tabs>
+          <w:tab w:val="num" w:pos="720"/>
+        </w:tabs>
+        <w:ind w:left="720" w:hanging="360"/>
+      </w:pPr>
+      <w:rPr>
+        <w:rFonts w:ascii="Symbol" w:hAnsi="Symbol" w:hint="default"/>
+        <w:sz w:val="20"/>
+      </w:rPr>
+    </w:lvl>
+    <w:lvl w:ilvl="1" w:tentative="1">
+      <w:start w:val="1"/>
+      <w:numFmt w:val="bullet"/>
+      <w:lvlText w:val="o"/>
+      <w:lvlJc w:val="left"/>
+      <w:pPr>
+        <w:tabs>
+          <w:tab w:val="num" w:pos="1440"/>
+        </w:tabs>
+        <w:ind w:left="1440" w:hanging="360"/>
+      </w:pPr>
+      <w:rPr>
+        <w:rFonts w:ascii="Courier New" w:hAnsi="Courier New" w:hint="default"/>
+        <w:sz w:val="20"/>
+      </w:rPr>
+    </w:lvl>
+    <w:lvl w:ilvl="2" w:tentative="1">
+      <w:start w:val="1"/>
+      <w:numFmt w:val="bullet"/>
+      <w:lvlText w:val=""/>
+      <w:lvlJc w:val="left"/>
+      <w:pPr>
+        <w:tabs>
+          <w:tab w:val="num" w:pos="2160"/>
+        </w:tabs>
+        <w:ind w:left="2160" w:hanging="360"/>
+      </w:pPr>
+      <w:rPr>
+        <w:rFonts w:ascii="Wingdings" w:hAnsi="Wingdings" w:hint="default"/>
+        <w:sz w:val="20"/>
+      </w:rPr>
+    </w:lvl>
+    <w:lvl w:ilvl="3" w:tentative="1">
+      <w:start w:val="1"/>
+      <w:numFmt w:val="bullet"/>
+      <w:lvlText w:val=""/>
+      <w:lvlJc w:val="left"/>
+      <w:pPr>
+        <w:tabs>
+          <w:tab w:val="num" w:pos="2880"/>
+        </w:tabs>
+        <w:ind w:left="2880" w:hanging="360"/>
+      </w:pPr>
+      <w:rPr>
+        <w:rFonts w:ascii="Wingdings" w:hAnsi="Wingdings" w:hint="default"/>
+        <w:sz w:val="20"/>
+      </w:rPr>
+    </w:lvl>
+    <w:lvl w:ilvl="4" w:tentative="1">
+      <w:start w:val="1"/>
+      <w:numFmt w:val="bullet"/>
+      <w:lvlText w:val=""/>
+      <w:lvlJc w:val="left"/>
+      <w:pPr>
+        <w:tabs>
+          <w:tab w:val="num" w:pos="3600"/>
+        </w:tabs>
+        <w:ind w:left="3600" w:hanging="360"/>
+      </w:pPr>
+      <w:rPr>
+        <w:rFonts w:ascii="Wingdings" w:hAnsi="Wingdings" w:hint="default"/>
+        <w:sz w:val="20"/>
+      </w:rPr>
+    </w:lvl>
+    <w:lvl w:ilvl="5" w:tentative="1">
+      <w:start w:val="1"/>
+      <w:numFmt w:val="bullet"/>
+      <w:lvlText w:val=""/>
+      <w:lvlJc w:val="left"/>
+      <w:pPr>
+        <w:tabs>
+          <w:tab w:val="num" w:pos="4320"/>
+        </w:tabs>
+        <w:ind w:left="4320" w:hanging="360"/>
+      </w:pPr>
+      <w:rPr>
+        <w:rFonts w:ascii="Wingdings" w:hAnsi="Wingdings" w:hint="default"/>
+        <w:sz w:val="20"/>
+      </w:rPr>
+    </w:lvl>
+    <w:lvl w:ilvl="6" w:tentative="1">
+      <w:start w:val="1"/>
+      <w:numFmt w:val="bullet"/>
+      <w:lvlText w:val=""/>
+      <w:lvlJc w:val="left"/>
+      <w:pPr>
+        <w:tabs>
+          <w:tab w:val="num" w:pos="5040"/>
+        </w:tabs>
+        <w:ind w:left="5040" w:hanging="360"/>
+      </w:pPr>
+      <w:rPr>
+        <w:rFonts w:ascii="Wingdings" w:hAnsi="Wingdings" w:hint="default"/>
+        <w:sz w:val="20"/>
+      </w:rPr>
+    </w:lvl>
+    <w:lvl w:ilvl="7" w:tentative="1">
+      <w:start w:val="1"/>
+      <w:numFmt w:val="bullet"/>
+      <w:lvlText w:val=""/>
+      <w:lvlJc w:val="left"/>
+      <w:pPr>
+        <w:tabs>
+          <w:tab w:val="num" w:pos="5760"/>
+        </w:tabs>
+        <w:ind w:left="5760" w:hanging="360"/>
+      </w:pPr>
+      <w:rPr>
+        <w:rFonts w:ascii="Wingdings" w:hAnsi="Wingdings" w:hint="default"/>
+        <w:sz w:val="20"/>
+      </w:rPr>
+    </w:lvl>
+    <w:lvl w:ilvl="8" w:tentative="1">
+      <w:start w:val="1"/>
+      <w:numFmt w:val="bullet"/>
+      <w:lvlText w:val=""/>
+      <w:lvlJc w:val="left"/>
+      <w:pPr>
+        <w:tabs>
+          <w:tab w:val="num" w:pos="6480"/>
+        </w:tabs>
+        <w:ind w:left="6480" w:hanging="360"/>
+      </w:pPr>
+      <w:rPr>
+        <w:rFonts w:ascii="Wingdings" w:hAnsi="Wingdings" w:hint="default"/>
+        <w:sz w:val="20"/>
+      </w:rPr>
+    </w:lvl>
+  </w:abstractNum>
+  <w:abstractNum w:abstractNumId="2" w15:restartNumberingAfterBreak="0">
+    <w:nsid w:val="63F628AB"/>
+    <w:multiLevelType w:val="multilevel"/>
+    <w:tmpl w:val="B37E949E"/>
+    <w:lvl w:ilvl="0">
+      <w:start w:val="1"/>
+      <w:numFmt w:val="bullet"/>
+      <w:lvlText w:val=""/>
+      <w:lvlJc w:val="left"/>
+      <w:pPr>
+        <w:tabs>
+          <w:tab w:val="num" w:pos="720"/>
+        </w:tabs>
+        <w:ind w:left="720" w:hanging="360"/>
+      </w:pPr>
+      <w:rPr>
+        <w:rFonts w:ascii="Symbol" w:hAnsi="Symbol" w:hint="default"/>
+        <w:sz w:val="20"/>
+      </w:rPr>
+    </w:lvl>
+    <w:lvl w:ilvl="1" w:tentative="1">
+      <w:start w:val="1"/>
+      <w:numFmt w:val="bullet"/>
+      <w:lvlText w:val="o"/>
+      <w:lvlJc w:val="left"/>
+      <w:pPr>
+        <w:tabs>
+          <w:tab w:val="num" w:pos="1440"/>
+        </w:tabs>
+        <w:ind w:left="1440" w:hanging="360"/>
+      </w:pPr>
+      <w:rPr>
+        <w:rFonts w:ascii="Courier New" w:hAnsi="Courier New" w:hint="default"/>
+        <w:sz w:val="20"/>
+      </w:rPr>
+    </w:lvl>
+    <w:lvl w:ilvl="2" w:tentative="1">
+      <w:start w:val="1"/>
+      <w:numFmt w:val="bullet"/>
+      <w:lvlText w:val=""/>
+      <w:lvlJc w:val="left"/>
+      <w:pPr>
+        <w:tabs>
+          <w:tab w:val="num" w:pos="2160"/>
+        </w:tabs>
+        <w:ind w:left="2160" w:hanging="360"/>
+      </w:pPr>
+      <w:rPr>
+        <w:rFonts w:ascii="Wingdings" w:hAnsi="Wingdings" w:hint="default"/>
+        <w:sz w:val="20"/>
+      </w:rPr>
+    </w:lvl>
+    <w:lvl w:ilvl="3" w:tentative="1">
+      <w:start w:val="1"/>
+      <w:numFmt w:val="bullet"/>
+      <w:lvlText w:val=""/>
+      <w:lvlJc w:val="left"/>
+      <w:pPr>
+        <w:tabs>
+          <w:tab w:val="num" w:pos="2880"/>
+        </w:tabs>
+        <w:ind w:left="2880" w:hanging="360"/>
+      </w:pPr>
+      <w:rPr>
+        <w:rFonts w:ascii="Wingdings" w:hAnsi="Wingdings" w:hint="default"/>
+        <w:sz w:val="20"/>
+      </w:rPr>
+    </w:lvl>
+    <w:lvl w:ilvl="4" w:tentative="1">
+      <w:start w:val="1"/>
+      <w:numFmt w:val="bullet"/>
+      <w:lvlText w:val=""/>
+      <w:lvlJc w:val="left"/>
+      <w:pPr>
+        <w:tabs>
+          <w:tab w:val="num" w:pos="3600"/>
+        </w:tabs>
+        <w:ind w:left="3600" w:hanging="360"/>
+      </w:pPr>
+      <w:rPr>
+        <w:rFonts w:ascii="Wingdings" w:hAnsi="Wingdings" w:hint="default"/>
+        <w:sz w:val="20"/>
+      </w:rPr>
+    </w:lvl>
+    <w:lvl w:ilvl="5" w:tentative="1">
+      <w:start w:val="1"/>
+      <w:numFmt w:val="bullet"/>
+      <w:lvlText w:val=""/>
+      <w:lvlJc w:val="left"/>
+      <w:pPr>
+        <w:tabs>
+          <w:tab w:val="num" w:pos="4320"/>
+        </w:tabs>
+        <w:ind w:left="4320" w:hanging="360"/>
+      </w:pPr>
+      <w:rPr>
+        <w:rFonts w:ascii="Wingdings" w:hAnsi="Wingdings" w:hint="default"/>
+        <w:sz w:val="20"/>
+      </w:rPr>
+    </w:lvl>
+    <w:lvl w:ilvl="6" w:tentative="1">
+      <w:start w:val="1"/>
+      <w:numFmt w:val="bullet"/>
+      <w:lvlText w:val=""/>
+      <w:lvlJc w:val="left"/>
+      <w:pPr>
+        <w:tabs>
+          <w:tab w:val="num" w:pos="5040"/>
+        </w:tabs>
+        <w:ind w:left="5040" w:hanging="360"/>
+      </w:pPr>
+      <w:rPr>
+        <w:rFonts w:ascii="Wingdings" w:hAnsi="Wingdings" w:hint="default"/>
+        <w:sz w:val="20"/>
+      </w:rPr>
+    </w:lvl>
+    <w:lvl w:ilvl="7" w:tentative="1">
+      <w:start w:val="1"/>
+      <w:numFmt w:val="bullet"/>
+      <w:lvlText w:val=""/>
+      <w:lvlJc w:val="left"/>
+      <w:pPr>
+        <w:tabs>
+          <w:tab w:val="num" w:pos="5760"/>
+        </w:tabs>
+        <w:ind w:left="5760" w:hanging="360"/>
+      </w:pPr>
+      <w:rPr>
+        <w:rFonts w:ascii="Wingdings" w:hAnsi="Wingdings" w:hint="default"/>
+        <w:sz w:val="20"/>
+      </w:rPr>
+    </w:lvl>
+    <w:lvl w:ilvl="8" w:tentative="1">
+      <w:start w:val="1"/>
+      <w:numFmt w:val="bullet"/>
+      <w:lvlText w:val=""/>
+      <w:lvlJc w:val="left"/>
+      <w:pPr>
+        <w:tabs>
+          <w:tab w:val="num" w:pos="6480"/>
+        </w:tabs>
+        <w:ind w:left="6480" w:hanging="360"/>
+      </w:pPr>
+      <w:rPr>
+        <w:rFonts w:ascii="Wingdings" w:hAnsi="Wingdings" w:hint="default"/>
+        <w:sz w:val="20"/>
+      </w:rPr>
+    </w:lvl>
+  </w:abstractNum>
+  <w:num w:numId="1" w16cid:durableId="1847288556">
+    <w:abstractNumId w:val="2"/>
+  </w:num>
+  <w:num w:numId="2" w16cid:durableId="1922324853">
+    <w:abstractNumId w:val="1"/>
+  </w:num>
+  <w:num w:numId="3" w16cid:durableId="1716655098">
+    <w:abstractNumId w:val="0"/>
+  </w:num>
+</w:numbering>
 </file>
 
 <file path=word/styles.xml><?xml version="1.0" encoding="utf-8"?>
@@ -1621,7 +3209,6 @@
   <w:style w:type="character" w:default="1" w:styleId="Fuentedeprrafopredeter">
     <w:name w:val="Default Paragraph Font"/>
     <w:uiPriority w:val="1"/>
-    <w:semiHidden/>
     <w:unhideWhenUsed/>
   </w:style>
   <w:style w:type="table" w:default="1" w:styleId="Tablanormal">

</xml_diff>

<commit_message>
me faltó guardar el word en el commit anterior xd
</commit_message>
<xml_diff>
--- a/equipo09_IDY1103_EP1/evidencias/EVIDENCIAS.docx
+++ b/equipo09_IDY1103_EP1/evidencias/EVIDENCIAS.docx
@@ -182,12 +182,14 @@
     <w:p>
       <w:pPr>
         <w:rPr>
+          <w:u w:val="single"/>
           <w:lang w:val="es-419"/>
         </w:rPr>
       </w:pPr>
       <w:r>
         <w:rPr>
           <w:noProof/>
+          <w:u w:val="single"/>
           <w:lang w:val="es-419"/>
         </w:rPr>
         <w:drawing>
@@ -551,6 +553,7 @@
       </w:pPr>
       <w:r>
         <w:rPr>
+          <w:noProof/>
           <w:lang w:val="es-419"/>
         </w:rPr>
         <w:drawing>
@@ -954,6 +957,7 @@
       </w:pPr>
       <w:r>
         <w:rPr>
+          <w:noProof/>
           <w:lang w:val="es-419"/>
         </w:rPr>
         <w:drawing>
@@ -1001,6 +1005,7 @@
       </w:pPr>
       <w:r>
         <w:rPr>
+          <w:noProof/>
           <w:lang w:val="es-419"/>
         </w:rPr>
         <w:drawing>
@@ -1048,6 +1053,7 @@
       </w:pPr>
       <w:r>
         <w:rPr>
+          <w:noProof/>
           <w:lang w:val="es-419"/>
         </w:rPr>
         <w:lastRenderedPageBreak/>
@@ -1096,6 +1102,7 @@
       </w:pPr>
       <w:r>
         <w:rPr>
+          <w:noProof/>
           <w:lang w:val="es-419"/>
         </w:rPr>
         <w:drawing>
@@ -1185,6 +1192,7 @@
       </w:pPr>
       <w:r>
         <w:rPr>
+          <w:noProof/>
           <w:lang w:val="es-419"/>
         </w:rPr>
         <w:drawing>
@@ -1258,6 +1266,7 @@
       </w:pPr>
       <w:r>
         <w:rPr>
+          <w:noProof/>
           <w:lang w:val="es-419"/>
         </w:rPr>
         <w:drawing>
@@ -1305,6 +1314,7 @@
       </w:pPr>
       <w:r>
         <w:rPr>
+          <w:noProof/>
           <w:lang w:val="es-419"/>
         </w:rPr>
         <w:lastRenderedPageBreak/>
@@ -1353,6 +1363,7 @@
       </w:pPr>
       <w:r>
         <w:rPr>
+          <w:noProof/>
           <w:lang w:val="es-419"/>
         </w:rPr>
         <w:drawing>
@@ -1400,6 +1411,7 @@
       </w:pPr>
       <w:r>
         <w:rPr>
+          <w:noProof/>
           <w:lang w:val="es-419"/>
         </w:rPr>
         <w:lastRenderedPageBreak/>
@@ -1467,6 +1479,7 @@
       </w:pPr>
       <w:r>
         <w:rPr>
+          <w:noProof/>
           <w:lang w:val="es-419"/>
         </w:rPr>
         <w:drawing>
@@ -1514,6 +1527,7 @@
       </w:pPr>
       <w:r>
         <w:rPr>
+          <w:noProof/>
           <w:lang w:val="es-419"/>
         </w:rPr>
         <w:lastRenderedPageBreak/>
@@ -1575,6 +1589,7 @@
       </w:pPr>
       <w:r>
         <w:rPr>
+          <w:noProof/>
           <w:lang w:val="es-419"/>
         </w:rPr>
         <w:drawing>
@@ -1622,6 +1637,7 @@
       </w:pPr>
       <w:r>
         <w:rPr>
+          <w:noProof/>
           <w:lang w:val="es-419"/>
         </w:rPr>
         <w:lastRenderedPageBreak/>
@@ -1710,6 +1726,7 @@
       </w:pPr>
       <w:r>
         <w:rPr>
+          <w:noProof/>
           <w:lang w:val="es-419"/>
         </w:rPr>
         <w:drawing>
@@ -1757,6 +1774,7 @@
       </w:pPr>
       <w:r>
         <w:rPr>
+          <w:noProof/>
           <w:lang w:val="es-419"/>
         </w:rPr>
         <w:drawing>
@@ -1804,6 +1822,7 @@
       </w:pPr>
       <w:r>
         <w:rPr>
+          <w:noProof/>
           <w:lang w:val="es-419"/>
         </w:rPr>
         <w:lastRenderedPageBreak/>
@@ -1865,6 +1884,7 @@
       </w:pPr>
       <w:r>
         <w:rPr>
+          <w:noProof/>
           <w:lang w:val="es-419"/>
         </w:rPr>
         <w:drawing>
@@ -1912,6 +1932,7 @@
       </w:pPr>
       <w:r>
         <w:rPr>
+          <w:noProof/>
           <w:lang w:val="es-419"/>
         </w:rPr>
         <w:lastRenderedPageBreak/>
@@ -1960,6 +1981,7 @@
       </w:pPr>
       <w:r>
         <w:rPr>
+          <w:noProof/>
           <w:lang w:val="es-419"/>
         </w:rPr>
         <w:drawing>
@@ -2005,11 +2027,265 @@
           <w:lang w:val="es-419"/>
         </w:rPr>
       </w:pPr>
-      <w:r>
-        <w:rPr>
-          <w:lang w:val="es-419"/>
-        </w:rPr>
-        <w:t>B3</w:t>
+    </w:p>
+    <w:p>
+      <w:pPr>
+        <w:rPr>
+          <w:lang w:val="es-419"/>
+        </w:rPr>
+      </w:pPr>
+    </w:p>
+    <w:p>
+      <w:pPr>
+        <w:rPr>
+          <w:lang w:val="es-419"/>
+        </w:rPr>
+      </w:pPr>
+      <w:r>
+        <w:rPr>
+          <w:lang w:val="es-419"/>
+        </w:rPr>
+        <w:br w:type="page"/>
+      </w:r>
+    </w:p>
+    <w:p>
+      <w:pPr>
+        <w:rPr>
+          <w:lang w:val="es-419"/>
+        </w:rPr>
+      </w:pPr>
+      <w:r>
+        <w:rPr>
+          <w:lang w:val="es-419"/>
+        </w:rPr>
+        <w:lastRenderedPageBreak/>
+        <w:t>MONGO</w:t>
+      </w:r>
+    </w:p>
+    <w:p>
+      <w:pPr>
+        <w:rPr>
+          <w:lang w:val="es-419"/>
+        </w:rPr>
+      </w:pPr>
+      <w:r>
+        <w:rPr>
+          <w:lang w:val="es-419"/>
+        </w:rPr>
+        <w:t>B1</w:t>
+      </w:r>
+    </w:p>
+    <w:p>
+      <w:pPr>
+        <w:rPr>
+          <w:lang w:val="es-419"/>
+        </w:rPr>
+      </w:pPr>
+      <w:r>
+        <w:rPr>
+          <w:lang w:val="es-419"/>
+        </w:rPr>
+        <w:drawing>
+          <wp:inline distT="0" distB="0" distL="0" distR="0" wp14:anchorId="5C4469DA" wp14:editId="479DB31A">
+            <wp:extent cx="4534533" cy="7011378"/>
+            <wp:effectExtent l="0" t="0" r="0" b="0"/>
+            <wp:docPr id="839272608" name="Imagen 1"/>
+            <wp:cNvGraphicFramePr>
+              <a:graphicFrameLocks xmlns:a="http://schemas.openxmlformats.org/drawingml/2006/main" noChangeAspect="1"/>
+            </wp:cNvGraphicFramePr>
+            <a:graphic xmlns:a="http://schemas.openxmlformats.org/drawingml/2006/main">
+              <a:graphicData uri="http://schemas.openxmlformats.org/drawingml/2006/picture">
+                <pic:pic xmlns:pic="http://schemas.openxmlformats.org/drawingml/2006/picture">
+                  <pic:nvPicPr>
+                    <pic:cNvPr id="839272608" name=""/>
+                    <pic:cNvPicPr/>
+                  </pic:nvPicPr>
+                  <pic:blipFill>
+                    <a:blip r:embed="rId41"/>
+                    <a:stretch>
+                      <a:fillRect/>
+                    </a:stretch>
+                  </pic:blipFill>
+                  <pic:spPr>
+                    <a:xfrm>
+                      <a:off x="0" y="0"/>
+                      <a:ext cx="4534533" cy="7011378"/>
+                    </a:xfrm>
+                    <a:prstGeom prst="rect">
+                      <a:avLst/>
+                    </a:prstGeom>
+                  </pic:spPr>
+                </pic:pic>
+              </a:graphicData>
+            </a:graphic>
+          </wp:inline>
+        </w:drawing>
+      </w:r>
+    </w:p>
+    <w:p>
+      <w:pPr>
+        <w:rPr>
+          <w:lang w:val="es-419"/>
+        </w:rPr>
+      </w:pPr>
+      <w:r>
+        <w:rPr>
+          <w:lang w:val="es-419"/>
+        </w:rPr>
+        <w:t>B2</w:t>
+      </w:r>
+    </w:p>
+    <w:p>
+      <w:pPr>
+        <w:rPr>
+          <w:lang w:val="es-419"/>
+        </w:rPr>
+      </w:pPr>
+    </w:p>
+    <w:p>
+      <w:pPr>
+        <w:rPr>
+          <w:lang w:val="es-419"/>
+        </w:rPr>
+      </w:pPr>
+    </w:p>
+    <w:p>
+      <w:pPr>
+        <w:rPr>
+          <w:lang w:val="es-419"/>
+        </w:rPr>
+      </w:pPr>
+      <w:r>
+        <w:rPr>
+          <w:lang w:val="es-419"/>
+        </w:rPr>
+        <w:drawing>
+          <wp:inline distT="0" distB="0" distL="0" distR="0" wp14:anchorId="61401F56" wp14:editId="73FF02C7">
+            <wp:extent cx="4629796" cy="5925377"/>
+            <wp:effectExtent l="0" t="0" r="0" b="0"/>
+            <wp:docPr id="678059699" name="Imagen 1"/>
+            <wp:cNvGraphicFramePr>
+              <a:graphicFrameLocks xmlns:a="http://schemas.openxmlformats.org/drawingml/2006/main" noChangeAspect="1"/>
+            </wp:cNvGraphicFramePr>
+            <a:graphic xmlns:a="http://schemas.openxmlformats.org/drawingml/2006/main">
+              <a:graphicData uri="http://schemas.openxmlformats.org/drawingml/2006/picture">
+                <pic:pic xmlns:pic="http://schemas.openxmlformats.org/drawingml/2006/picture">
+                  <pic:nvPicPr>
+                    <pic:cNvPr id="678059699" name=""/>
+                    <pic:cNvPicPr/>
+                  </pic:nvPicPr>
+                  <pic:blipFill>
+                    <a:blip r:embed="rId42"/>
+                    <a:stretch>
+                      <a:fillRect/>
+                    </a:stretch>
+                  </pic:blipFill>
+                  <pic:spPr>
+                    <a:xfrm>
+                      <a:off x="0" y="0"/>
+                      <a:ext cx="4629796" cy="5925377"/>
+                    </a:xfrm>
+                    <a:prstGeom prst="rect">
+                      <a:avLst/>
+                    </a:prstGeom>
+                  </pic:spPr>
+                </pic:pic>
+              </a:graphicData>
+            </a:graphic>
+          </wp:inline>
+        </w:drawing>
+      </w:r>
+    </w:p>
+    <w:p>
+      <w:pPr>
+        <w:rPr>
+          <w:u w:val="single"/>
+          <w:lang w:val="es-419"/>
+        </w:rPr>
+      </w:pPr>
+      <w:r>
+        <w:rPr>
+          <w:u w:val="single"/>
+          <w:lang w:val="es-419"/>
+        </w:rPr>
+        <w:lastRenderedPageBreak/>
+        <w:drawing>
+          <wp:inline distT="0" distB="0" distL="0" distR="0" wp14:anchorId="40B89244" wp14:editId="03D01DC3">
+            <wp:extent cx="4267796" cy="7554379"/>
+            <wp:effectExtent l="0" t="0" r="0" b="0"/>
+            <wp:docPr id="1317583820" name="Imagen 1"/>
+            <wp:cNvGraphicFramePr>
+              <a:graphicFrameLocks xmlns:a="http://schemas.openxmlformats.org/drawingml/2006/main" noChangeAspect="1"/>
+            </wp:cNvGraphicFramePr>
+            <a:graphic xmlns:a="http://schemas.openxmlformats.org/drawingml/2006/main">
+              <a:graphicData uri="http://schemas.openxmlformats.org/drawingml/2006/picture">
+                <pic:pic xmlns:pic="http://schemas.openxmlformats.org/drawingml/2006/picture">
+                  <pic:nvPicPr>
+                    <pic:cNvPr id="1317583820" name=""/>
+                    <pic:cNvPicPr/>
+                  </pic:nvPicPr>
+                  <pic:blipFill>
+                    <a:blip r:embed="rId43"/>
+                    <a:stretch>
+                      <a:fillRect/>
+                    </a:stretch>
+                  </pic:blipFill>
+                  <pic:spPr>
+                    <a:xfrm>
+                      <a:off x="0" y="0"/>
+                      <a:ext cx="4267796" cy="7554379"/>
+                    </a:xfrm>
+                    <a:prstGeom prst="rect">
+                      <a:avLst/>
+                    </a:prstGeom>
+                  </pic:spPr>
+                </pic:pic>
+              </a:graphicData>
+            </a:graphic>
+          </wp:inline>
+        </w:drawing>
+      </w:r>
+    </w:p>
+    <w:p>
+      <w:pPr>
+        <w:rPr>
+          <w:lang w:val="es-419"/>
+        </w:rPr>
+      </w:pPr>
+    </w:p>
+    <w:p>
+      <w:pPr>
+        <w:rPr>
+          <w:lang w:val="es-419"/>
+        </w:rPr>
+      </w:pPr>
+    </w:p>
+    <w:p>
+      <w:pPr>
+        <w:rPr>
+          <w:lang w:val="es-419"/>
+        </w:rPr>
+      </w:pPr>
+      <w:r>
+        <w:rPr>
+          <w:lang w:val="es-419"/>
+        </w:rPr>
+        <w:lastRenderedPageBreak/>
+        <w:t>IMPORTACIÓN DE 33 archivos .</w:t>
+      </w:r>
+      <w:proofErr w:type="spellStart"/>
+      <w:r>
+        <w:rPr>
+          <w:lang w:val="es-419"/>
+        </w:rPr>
+        <w:t>csv</w:t>
+      </w:r>
+      <w:proofErr w:type="spellEnd"/>
+      <w:r>
+        <w:rPr>
+          <w:lang w:val="es-419"/>
+        </w:rPr>
+        <w:t xml:space="preserve"> de MOV</w:t>
       </w:r>
     </w:p>
     <w:p>
@@ -2023,11 +2299,10 @@
           <w:noProof/>
           <w:lang w:val="es-419"/>
         </w:rPr>
-        <w:lastRenderedPageBreak/>
-        <w:drawing>
-          <wp:inline distT="0" distB="0" distL="0" distR="0" wp14:anchorId="21CF07DA" wp14:editId="3217A6C8">
-            <wp:extent cx="5610860" cy="5939790"/>
-            <wp:effectExtent l="0" t="0" r="8890" b="3810"/>
+        <w:drawing>
+          <wp:inline distT="0" distB="0" distL="0" distR="0" wp14:anchorId="0011B363" wp14:editId="1E132D5A">
+            <wp:extent cx="5175668" cy="5479085"/>
+            <wp:effectExtent l="0" t="0" r="6350" b="7620"/>
             <wp:docPr id="1635811625" name="Imagen 4"/>
             <wp:cNvGraphicFramePr>
               <a:graphicFrameLocks xmlns:a="http://schemas.openxmlformats.org/drawingml/2006/main" noChangeAspect="1"/>
@@ -2042,7 +2317,7 @@
                     </pic:cNvPicPr>
                   </pic:nvPicPr>
                   <pic:blipFill>
-                    <a:blip r:embed="rId41">
+                    <a:blip r:embed="rId44">
                       <a:extLst>
                         <a:ext uri="{28A0092B-C50C-407E-A947-70E740481C1C}">
                           <a14:useLocalDpi xmlns:a14="http://schemas.microsoft.com/office/drawing/2010/main" val="0"/>
@@ -2057,7 +2332,7 @@
                   <pic:spPr bwMode="auto">
                     <a:xfrm>
                       <a:off x="0" y="0"/>
-                      <a:ext cx="5610860" cy="5939790"/>
+                      <a:ext cx="5176534" cy="5480002"/>
                     </a:xfrm>
                     <a:prstGeom prst="rect">
                       <a:avLst/>
@@ -2086,7 +2361,7 @@
           <w:lang w:val="es-419"/>
         </w:rPr>
         <w:drawing>
-          <wp:inline distT="0" distB="0" distL="0" distR="0" wp14:anchorId="2EDE852A" wp14:editId="0E24F7C4">
+          <wp:inline distT="0" distB="0" distL="0" distR="0" wp14:anchorId="4C138507" wp14:editId="23E3483E">
             <wp:extent cx="5610860" cy="2099310"/>
             <wp:effectExtent l="0" t="0" r="8890" b="0"/>
             <wp:docPr id="1844349806" name="Imagen 6"/>
@@ -2103,7 +2378,7 @@
                     </pic:cNvPicPr>
                   </pic:nvPicPr>
                   <pic:blipFill>
-                    <a:blip r:embed="rId42">
+                    <a:blip r:embed="rId45">
                       <a:extLst>
                         <a:ext uri="{28A0092B-C50C-407E-A947-70E740481C1C}">
                           <a14:useLocalDpi xmlns:a14="http://schemas.microsoft.com/office/drawing/2010/main" val="0"/>
@@ -2127,6 +2402,650 @@
                     <a:ln>
                       <a:noFill/>
                     </a:ln>
+                  </pic:spPr>
+                </pic:pic>
+              </a:graphicData>
+            </a:graphic>
+          </wp:inline>
+        </w:drawing>
+      </w:r>
+    </w:p>
+    <w:p>
+      <w:pPr>
+        <w:rPr>
+          <w:lang w:val="es-419"/>
+        </w:rPr>
+      </w:pPr>
+      <w:r>
+        <w:rPr>
+          <w:lang w:val="es-419"/>
+        </w:rPr>
+        <w:lastRenderedPageBreak/>
+        <w:t>B3</w:t>
+      </w:r>
+    </w:p>
+    <w:p>
+      <w:pPr>
+        <w:rPr>
+          <w:lang w:val="es-419"/>
+        </w:rPr>
+      </w:pPr>
+      <w:r>
+        <w:rPr>
+          <w:lang w:val="es-419"/>
+        </w:rPr>
+        <w:t>MONGO_USER_1...</w:t>
+      </w:r>
+    </w:p>
+    <w:p>
+      <w:pPr>
+        <w:rPr>
+          <w:lang w:val="es-419"/>
+        </w:rPr>
+      </w:pPr>
+      <w:r>
+        <w:rPr>
+          <w:lang w:val="es-419"/>
+        </w:rPr>
+        <w:drawing>
+          <wp:inline distT="0" distB="0" distL="0" distR="0" wp14:anchorId="4C094286" wp14:editId="37AD96A5">
+            <wp:extent cx="5612130" cy="3073400"/>
+            <wp:effectExtent l="0" t="0" r="7620" b="0"/>
+            <wp:docPr id="130094165" name="Imagen 1"/>
+            <wp:cNvGraphicFramePr>
+              <a:graphicFrameLocks xmlns:a="http://schemas.openxmlformats.org/drawingml/2006/main" noChangeAspect="1"/>
+            </wp:cNvGraphicFramePr>
+            <a:graphic xmlns:a="http://schemas.openxmlformats.org/drawingml/2006/main">
+              <a:graphicData uri="http://schemas.openxmlformats.org/drawingml/2006/picture">
+                <pic:pic xmlns:pic="http://schemas.openxmlformats.org/drawingml/2006/picture">
+                  <pic:nvPicPr>
+                    <pic:cNvPr id="130094165" name=""/>
+                    <pic:cNvPicPr/>
+                  </pic:nvPicPr>
+                  <pic:blipFill>
+                    <a:blip r:embed="rId46"/>
+                    <a:stretch>
+                      <a:fillRect/>
+                    </a:stretch>
+                  </pic:blipFill>
+                  <pic:spPr>
+                    <a:xfrm>
+                      <a:off x="0" y="0"/>
+                      <a:ext cx="5612130" cy="3073400"/>
+                    </a:xfrm>
+                    <a:prstGeom prst="rect">
+                      <a:avLst/>
+                    </a:prstGeom>
+                  </pic:spPr>
+                </pic:pic>
+              </a:graphicData>
+            </a:graphic>
+          </wp:inline>
+        </w:drawing>
+      </w:r>
+    </w:p>
+    <w:p>
+      <w:pPr>
+        <w:rPr>
+          <w:lang w:val="es-419"/>
+        </w:rPr>
+      </w:pPr>
+      <w:r>
+        <w:rPr>
+          <w:lang w:val="es-419"/>
+        </w:rPr>
+        <w:drawing>
+          <wp:inline distT="0" distB="0" distL="0" distR="0" wp14:anchorId="65DF81F6" wp14:editId="13F6775D">
+            <wp:extent cx="5612130" cy="4343400"/>
+            <wp:effectExtent l="0" t="0" r="7620" b="0"/>
+            <wp:docPr id="1418197407" name="Imagen 1"/>
+            <wp:cNvGraphicFramePr>
+              <a:graphicFrameLocks xmlns:a="http://schemas.openxmlformats.org/drawingml/2006/main" noChangeAspect="1"/>
+            </wp:cNvGraphicFramePr>
+            <a:graphic xmlns:a="http://schemas.openxmlformats.org/drawingml/2006/main">
+              <a:graphicData uri="http://schemas.openxmlformats.org/drawingml/2006/picture">
+                <pic:pic xmlns:pic="http://schemas.openxmlformats.org/drawingml/2006/picture">
+                  <pic:nvPicPr>
+                    <pic:cNvPr id="1418197407" name=""/>
+                    <pic:cNvPicPr/>
+                  </pic:nvPicPr>
+                  <pic:blipFill>
+                    <a:blip r:embed="rId47"/>
+                    <a:stretch>
+                      <a:fillRect/>
+                    </a:stretch>
+                  </pic:blipFill>
+                  <pic:spPr>
+                    <a:xfrm>
+                      <a:off x="0" y="0"/>
+                      <a:ext cx="5612130" cy="4343400"/>
+                    </a:xfrm>
+                    <a:prstGeom prst="rect">
+                      <a:avLst/>
+                    </a:prstGeom>
+                  </pic:spPr>
+                </pic:pic>
+              </a:graphicData>
+            </a:graphic>
+          </wp:inline>
+        </w:drawing>
+      </w:r>
+    </w:p>
+    <w:p>
+      <w:pPr>
+        <w:rPr>
+          <w:lang w:val="es-419"/>
+        </w:rPr>
+      </w:pPr>
+      <w:r>
+        <w:rPr>
+          <w:lang w:val="es-419"/>
+        </w:rPr>
+        <w:lastRenderedPageBreak/>
+        <w:t xml:space="preserve">o </w:t>
+      </w:r>
+      <w:proofErr w:type="spellStart"/>
+      <w:r>
+        <w:rPr>
+          <w:lang w:val="es-419"/>
+        </w:rPr>
+        <w:t>find</w:t>
+      </w:r>
+      <w:proofErr w:type="spellEnd"/>
+      <w:r>
+        <w:rPr>
+          <w:lang w:val="es-419"/>
+        </w:rPr>
+        <w:t>/</w:t>
+      </w:r>
+      <w:proofErr w:type="spellStart"/>
+      <w:r>
+        <w:rPr>
+          <w:lang w:val="es-419"/>
+        </w:rPr>
+        <w:t>aggregate</w:t>
+      </w:r>
+      <w:proofErr w:type="spellEnd"/>
+      <w:r>
+        <w:rPr>
+          <w:lang w:val="es-419"/>
+        </w:rPr>
+        <w:t xml:space="preserve"> permitido</w:t>
+      </w:r>
+    </w:p>
+    <w:p>
+      <w:pPr>
+        <w:rPr>
+          <w:lang w:val="es-419"/>
+        </w:rPr>
+      </w:pPr>
+      <w:r>
+        <w:rPr>
+          <w:lang w:val="es-419"/>
+        </w:rPr>
+        <w:drawing>
+          <wp:inline distT="0" distB="0" distL="0" distR="0" wp14:anchorId="33B137F8" wp14:editId="56A8689B">
+            <wp:extent cx="5612130" cy="2846705"/>
+            <wp:effectExtent l="0" t="0" r="7620" b="0"/>
+            <wp:docPr id="1202370555" name="Imagen 1"/>
+            <wp:cNvGraphicFramePr>
+              <a:graphicFrameLocks xmlns:a="http://schemas.openxmlformats.org/drawingml/2006/main" noChangeAspect="1"/>
+            </wp:cNvGraphicFramePr>
+            <a:graphic xmlns:a="http://schemas.openxmlformats.org/drawingml/2006/main">
+              <a:graphicData uri="http://schemas.openxmlformats.org/drawingml/2006/picture">
+                <pic:pic xmlns:pic="http://schemas.openxmlformats.org/drawingml/2006/picture">
+                  <pic:nvPicPr>
+                    <pic:cNvPr id="1202370555" name=""/>
+                    <pic:cNvPicPr/>
+                  </pic:nvPicPr>
+                  <pic:blipFill>
+                    <a:blip r:embed="rId48"/>
+                    <a:stretch>
+                      <a:fillRect/>
+                    </a:stretch>
+                  </pic:blipFill>
+                  <pic:spPr>
+                    <a:xfrm>
+                      <a:off x="0" y="0"/>
+                      <a:ext cx="5612130" cy="2846705"/>
+                    </a:xfrm>
+                    <a:prstGeom prst="rect">
+                      <a:avLst/>
+                    </a:prstGeom>
+                  </pic:spPr>
+                </pic:pic>
+              </a:graphicData>
+            </a:graphic>
+          </wp:inline>
+        </w:drawing>
+      </w:r>
+    </w:p>
+    <w:p>
+      <w:pPr>
+        <w:rPr>
+          <w:lang w:val="es-419"/>
+        </w:rPr>
+      </w:pPr>
+      <w:r>
+        <w:rPr>
+          <w:lang w:val="es-419"/>
+        </w:rPr>
+        <w:drawing>
+          <wp:inline distT="0" distB="0" distL="0" distR="0" wp14:anchorId="6492190F" wp14:editId="0606CF68">
+            <wp:extent cx="5612130" cy="2705735"/>
+            <wp:effectExtent l="0" t="0" r="7620" b="0"/>
+            <wp:docPr id="2076992075" name="Imagen 1"/>
+            <wp:cNvGraphicFramePr>
+              <a:graphicFrameLocks xmlns:a="http://schemas.openxmlformats.org/drawingml/2006/main" noChangeAspect="1"/>
+            </wp:cNvGraphicFramePr>
+            <a:graphic xmlns:a="http://schemas.openxmlformats.org/drawingml/2006/main">
+              <a:graphicData uri="http://schemas.openxmlformats.org/drawingml/2006/picture">
+                <pic:pic xmlns:pic="http://schemas.openxmlformats.org/drawingml/2006/picture">
+                  <pic:nvPicPr>
+                    <pic:cNvPr id="2076992075" name=""/>
+                    <pic:cNvPicPr/>
+                  </pic:nvPicPr>
+                  <pic:blipFill>
+                    <a:blip r:embed="rId49"/>
+                    <a:stretch>
+                      <a:fillRect/>
+                    </a:stretch>
+                  </pic:blipFill>
+                  <pic:spPr>
+                    <a:xfrm>
+                      <a:off x="0" y="0"/>
+                      <a:ext cx="5612130" cy="2705735"/>
+                    </a:xfrm>
+                    <a:prstGeom prst="rect">
+                      <a:avLst/>
+                    </a:prstGeom>
+                  </pic:spPr>
+                </pic:pic>
+              </a:graphicData>
+            </a:graphic>
+          </wp:inline>
+        </w:drawing>
+      </w:r>
+    </w:p>
+    <w:p>
+      <w:pPr>
+        <w:rPr>
+          <w:lang w:val="es-419"/>
+        </w:rPr>
+      </w:pPr>
+    </w:p>
+    <w:p>
+      <w:pPr>
+        <w:rPr>
+          <w:lang w:val="es-419"/>
+        </w:rPr>
+      </w:pPr>
+      <w:r>
+        <w:rPr>
+          <w:lang w:val="es-419"/>
+        </w:rPr>
+        <w:t xml:space="preserve">o </w:t>
+      </w:r>
+      <w:proofErr w:type="spellStart"/>
+      <w:r>
+        <w:rPr>
+          <w:lang w:val="es-419"/>
+        </w:rPr>
+        <w:t>insert</w:t>
+      </w:r>
+      <w:proofErr w:type="spellEnd"/>
+      <w:r>
+        <w:rPr>
+          <w:lang w:val="es-419"/>
+        </w:rPr>
+        <w:t>/</w:t>
+      </w:r>
+      <w:proofErr w:type="spellStart"/>
+      <w:r>
+        <w:rPr>
+          <w:lang w:val="es-419"/>
+        </w:rPr>
+        <w:t>update</w:t>
+      </w:r>
+      <w:proofErr w:type="spellEnd"/>
+      <w:r>
+        <w:rPr>
+          <w:lang w:val="es-419"/>
+        </w:rPr>
+        <w:t xml:space="preserve"> debe fallar</w:t>
+      </w:r>
+    </w:p>
+    <w:p>
+      <w:pPr>
+        <w:rPr>
+          <w:lang w:val="es-419"/>
+        </w:rPr>
+      </w:pPr>
+      <w:r>
+        <w:rPr>
+          <w:lang w:val="es-419"/>
+        </w:rPr>
+        <w:lastRenderedPageBreak/>
+        <w:drawing>
+          <wp:inline distT="0" distB="0" distL="0" distR="0" wp14:anchorId="77C261C1" wp14:editId="4DED6652">
+            <wp:extent cx="5612130" cy="2397760"/>
+            <wp:effectExtent l="0" t="0" r="7620" b="2540"/>
+            <wp:docPr id="217901689" name="Imagen 1"/>
+            <wp:cNvGraphicFramePr>
+              <a:graphicFrameLocks xmlns:a="http://schemas.openxmlformats.org/drawingml/2006/main" noChangeAspect="1"/>
+            </wp:cNvGraphicFramePr>
+            <a:graphic xmlns:a="http://schemas.openxmlformats.org/drawingml/2006/main">
+              <a:graphicData uri="http://schemas.openxmlformats.org/drawingml/2006/picture">
+                <pic:pic xmlns:pic="http://schemas.openxmlformats.org/drawingml/2006/picture">
+                  <pic:nvPicPr>
+                    <pic:cNvPr id="217901689" name=""/>
+                    <pic:cNvPicPr/>
+                  </pic:nvPicPr>
+                  <pic:blipFill>
+                    <a:blip r:embed="rId50"/>
+                    <a:stretch>
+                      <a:fillRect/>
+                    </a:stretch>
+                  </pic:blipFill>
+                  <pic:spPr>
+                    <a:xfrm>
+                      <a:off x="0" y="0"/>
+                      <a:ext cx="5612130" cy="2397760"/>
+                    </a:xfrm>
+                    <a:prstGeom prst="rect">
+                      <a:avLst/>
+                    </a:prstGeom>
+                  </pic:spPr>
+                </pic:pic>
+              </a:graphicData>
+            </a:graphic>
+          </wp:inline>
+        </w:drawing>
+      </w:r>
+    </w:p>
+    <w:p>
+      <w:pPr>
+        <w:rPr>
+          <w:lang w:val="es-419"/>
+        </w:rPr>
+      </w:pPr>
+      <w:r>
+        <w:rPr>
+          <w:lang w:val="es-419"/>
+        </w:rPr>
+        <w:drawing>
+          <wp:inline distT="0" distB="0" distL="0" distR="0" wp14:anchorId="1F612185" wp14:editId="7184DCF1">
+            <wp:extent cx="5612130" cy="2493645"/>
+            <wp:effectExtent l="0" t="0" r="7620" b="1905"/>
+            <wp:docPr id="2140225441" name="Imagen 1"/>
+            <wp:cNvGraphicFramePr>
+              <a:graphicFrameLocks xmlns:a="http://schemas.openxmlformats.org/drawingml/2006/main" noChangeAspect="1"/>
+            </wp:cNvGraphicFramePr>
+            <a:graphic xmlns:a="http://schemas.openxmlformats.org/drawingml/2006/main">
+              <a:graphicData uri="http://schemas.openxmlformats.org/drawingml/2006/picture">
+                <pic:pic xmlns:pic="http://schemas.openxmlformats.org/drawingml/2006/picture">
+                  <pic:nvPicPr>
+                    <pic:cNvPr id="2140225441" name=""/>
+                    <pic:cNvPicPr/>
+                  </pic:nvPicPr>
+                  <pic:blipFill>
+                    <a:blip r:embed="rId51"/>
+                    <a:stretch>
+                      <a:fillRect/>
+                    </a:stretch>
+                  </pic:blipFill>
+                  <pic:spPr>
+                    <a:xfrm>
+                      <a:off x="0" y="0"/>
+                      <a:ext cx="5612130" cy="2493645"/>
+                    </a:xfrm>
+                    <a:prstGeom prst="rect">
+                      <a:avLst/>
+                    </a:prstGeom>
+                  </pic:spPr>
+                </pic:pic>
+              </a:graphicData>
+            </a:graphic>
+          </wp:inline>
+        </w:drawing>
+      </w:r>
+    </w:p>
+    <w:p>
+      <w:pPr>
+        <w:rPr>
+          <w:lang w:val="es-419"/>
+        </w:rPr>
+      </w:pPr>
+      <w:r>
+        <w:rPr>
+          <w:lang w:val="es-419"/>
+        </w:rPr>
+        <w:br w:type="page"/>
+      </w:r>
+    </w:p>
+    <w:p>
+      <w:pPr>
+        <w:rPr>
+          <w:lang w:val="es-419"/>
+        </w:rPr>
+      </w:pPr>
+      <w:r>
+        <w:rPr>
+          <w:lang w:val="es-419"/>
+        </w:rPr>
+        <w:lastRenderedPageBreak/>
+        <w:t>• MONGO_AUDITOR...</w:t>
+      </w:r>
+    </w:p>
+    <w:p>
+      <w:pPr>
+        <w:rPr>
+          <w:lang w:val="es-419"/>
+        </w:rPr>
+      </w:pPr>
+      <w:r>
+        <w:rPr>
+          <w:lang w:val="es-419"/>
+        </w:rPr>
+        <w:drawing>
+          <wp:inline distT="0" distB="0" distL="0" distR="0" wp14:anchorId="4093C278" wp14:editId="2F2616DD">
+            <wp:extent cx="5612130" cy="3089910"/>
+            <wp:effectExtent l="0" t="0" r="7620" b="0"/>
+            <wp:docPr id="115874" name="Imagen 1"/>
+            <wp:cNvGraphicFramePr>
+              <a:graphicFrameLocks xmlns:a="http://schemas.openxmlformats.org/drawingml/2006/main" noChangeAspect="1"/>
+            </wp:cNvGraphicFramePr>
+            <a:graphic xmlns:a="http://schemas.openxmlformats.org/drawingml/2006/main">
+              <a:graphicData uri="http://schemas.openxmlformats.org/drawingml/2006/picture">
+                <pic:pic xmlns:pic="http://schemas.openxmlformats.org/drawingml/2006/picture">
+                  <pic:nvPicPr>
+                    <pic:cNvPr id="115874" name=""/>
+                    <pic:cNvPicPr/>
+                  </pic:nvPicPr>
+                  <pic:blipFill>
+                    <a:blip r:embed="rId52"/>
+                    <a:stretch>
+                      <a:fillRect/>
+                    </a:stretch>
+                  </pic:blipFill>
+                  <pic:spPr>
+                    <a:xfrm>
+                      <a:off x="0" y="0"/>
+                      <a:ext cx="5612130" cy="3089910"/>
+                    </a:xfrm>
+                    <a:prstGeom prst="rect">
+                      <a:avLst/>
+                    </a:prstGeom>
+                  </pic:spPr>
+                </pic:pic>
+              </a:graphicData>
+            </a:graphic>
+          </wp:inline>
+        </w:drawing>
+      </w:r>
+    </w:p>
+    <w:p>
+      <w:pPr>
+        <w:rPr>
+          <w:lang w:val="es-419"/>
+        </w:rPr>
+      </w:pPr>
+      <w:r>
+        <w:rPr>
+          <w:lang w:val="es-419"/>
+        </w:rPr>
+        <w:t>o acceso a registros/logs definidos para auditoría</w:t>
+      </w:r>
+    </w:p>
+    <w:p>
+      <w:pPr>
+        <w:rPr>
+          <w:lang w:val="es-419"/>
+        </w:rPr>
+      </w:pPr>
+      <w:r>
+        <w:rPr>
+          <w:lang w:val="es-419"/>
+        </w:rPr>
+        <w:drawing>
+          <wp:inline distT="0" distB="0" distL="0" distR="0" wp14:anchorId="6E8BAE68" wp14:editId="3C2F369D">
+            <wp:extent cx="5612130" cy="3211195"/>
+            <wp:effectExtent l="0" t="0" r="7620" b="8255"/>
+            <wp:docPr id="1149463910" name="Imagen 1"/>
+            <wp:cNvGraphicFramePr>
+              <a:graphicFrameLocks xmlns:a="http://schemas.openxmlformats.org/drawingml/2006/main" noChangeAspect="1"/>
+            </wp:cNvGraphicFramePr>
+            <a:graphic xmlns:a="http://schemas.openxmlformats.org/drawingml/2006/main">
+              <a:graphicData uri="http://schemas.openxmlformats.org/drawingml/2006/picture">
+                <pic:pic xmlns:pic="http://schemas.openxmlformats.org/drawingml/2006/picture">
+                  <pic:nvPicPr>
+                    <pic:cNvPr id="1149463910" name=""/>
+                    <pic:cNvPicPr/>
+                  </pic:nvPicPr>
+                  <pic:blipFill>
+                    <a:blip r:embed="rId53"/>
+                    <a:stretch>
+                      <a:fillRect/>
+                    </a:stretch>
+                  </pic:blipFill>
+                  <pic:spPr>
+                    <a:xfrm>
+                      <a:off x="0" y="0"/>
+                      <a:ext cx="5612130" cy="3211195"/>
+                    </a:xfrm>
+                    <a:prstGeom prst="rect">
+                      <a:avLst/>
+                    </a:prstGeom>
+                  </pic:spPr>
+                </pic:pic>
+              </a:graphicData>
+            </a:graphic>
+          </wp:inline>
+        </w:drawing>
+      </w:r>
+    </w:p>
+    <w:p>
+      <w:pPr>
+        <w:rPr>
+          <w:lang w:val="es-419"/>
+        </w:rPr>
+      </w:pPr>
+      <w:r>
+        <w:rPr>
+          <w:lang w:val="es-419"/>
+        </w:rPr>
+        <w:t>o no puede insertar ni modificar documentos de negocio</w:t>
+      </w:r>
+    </w:p>
+    <w:p>
+      <w:pPr>
+        <w:rPr>
+          <w:u w:val="single"/>
+          <w:lang w:val="es-419"/>
+        </w:rPr>
+      </w:pPr>
+      <w:r>
+        <w:rPr>
+          <w:u w:val="single"/>
+          <w:lang w:val="es-419"/>
+        </w:rPr>
+        <w:lastRenderedPageBreak/>
+        <w:drawing>
+          <wp:inline distT="0" distB="0" distL="0" distR="0" wp14:anchorId="06BE1B7B" wp14:editId="30F0B02C">
+            <wp:extent cx="5612130" cy="2237105"/>
+            <wp:effectExtent l="0" t="0" r="7620" b="0"/>
+            <wp:docPr id="1228354180" name="Imagen 1"/>
+            <wp:cNvGraphicFramePr>
+              <a:graphicFrameLocks xmlns:a="http://schemas.openxmlformats.org/drawingml/2006/main" noChangeAspect="1"/>
+            </wp:cNvGraphicFramePr>
+            <a:graphic xmlns:a="http://schemas.openxmlformats.org/drawingml/2006/main">
+              <a:graphicData uri="http://schemas.openxmlformats.org/drawingml/2006/picture">
+                <pic:pic xmlns:pic="http://schemas.openxmlformats.org/drawingml/2006/picture">
+                  <pic:nvPicPr>
+                    <pic:cNvPr id="1228354180" name=""/>
+                    <pic:cNvPicPr/>
+                  </pic:nvPicPr>
+                  <pic:blipFill>
+                    <a:blip r:embed="rId54"/>
+                    <a:stretch>
+                      <a:fillRect/>
+                    </a:stretch>
+                  </pic:blipFill>
+                  <pic:spPr>
+                    <a:xfrm>
+                      <a:off x="0" y="0"/>
+                      <a:ext cx="5612130" cy="2237105"/>
+                    </a:xfrm>
+                    <a:prstGeom prst="rect">
+                      <a:avLst/>
+                    </a:prstGeom>
+                  </pic:spPr>
+                </pic:pic>
+              </a:graphicData>
+            </a:graphic>
+          </wp:inline>
+        </w:drawing>
+      </w:r>
+    </w:p>
+    <w:p>
+      <w:pPr>
+        <w:rPr>
+          <w:lang w:val="es-419"/>
+        </w:rPr>
+      </w:pPr>
+      <w:r>
+        <w:rPr>
+          <w:lang w:val="es-419"/>
+        </w:rPr>
+        <w:drawing>
+          <wp:inline distT="0" distB="0" distL="0" distR="0" wp14:anchorId="4F749CC0" wp14:editId="27FCE79E">
+            <wp:extent cx="5612130" cy="2273300"/>
+            <wp:effectExtent l="0" t="0" r="7620" b="0"/>
+            <wp:docPr id="1905868132" name="Imagen 1"/>
+            <wp:cNvGraphicFramePr>
+              <a:graphicFrameLocks xmlns:a="http://schemas.openxmlformats.org/drawingml/2006/main" noChangeAspect="1"/>
+            </wp:cNvGraphicFramePr>
+            <a:graphic xmlns:a="http://schemas.openxmlformats.org/drawingml/2006/main">
+              <a:graphicData uri="http://schemas.openxmlformats.org/drawingml/2006/picture">
+                <pic:pic xmlns:pic="http://schemas.openxmlformats.org/drawingml/2006/picture">
+                  <pic:nvPicPr>
+                    <pic:cNvPr id="1905868132" name=""/>
+                    <pic:cNvPicPr/>
+                  </pic:nvPicPr>
+                  <pic:blipFill>
+                    <a:blip r:embed="rId55"/>
+                    <a:stretch>
+                      <a:fillRect/>
+                    </a:stretch>
+                  </pic:blipFill>
+                  <pic:spPr>
+                    <a:xfrm>
+                      <a:off x="0" y="0"/>
+                      <a:ext cx="5612130" cy="2273300"/>
+                    </a:xfrm>
+                    <a:prstGeom prst="rect">
+                      <a:avLst/>
+                    </a:prstGeom>
                   </pic:spPr>
                 </pic:pic>
               </a:graphicData>

</xml_diff>